<commit_message>
Check sections 3-7 against available sources; fix HOXC10 duplication size, population count, add missing citation
</commit_message>
<xml_diff>
--- a/3-7_v12_clean.docx
+++ b/3-7_v12_clean.docx
@@ -4657,7 +4657,16 @@
         <w:t xml:space="preserve">CAMK2D</w:t>
       </w:r>
       <w:r>
-        <w:t xml:space="preserve">）相关候选基因。在淮南鸡分离群体中，携带</w:t>
+        <w:t xml:space="preserve">）相关候选基因</w:t>
+      </w:r>
+      <w:r>
+        <w:rPr>
+          <w:vertAlign w:val="superscript"/>
+        </w:rPr>
+        <w:t xml:space="preserve">[84]</w:t>
+      </w:r>
+      <w:r>
+        <w:t xml:space="preserve">。在淮南鸡分离群体中，携带</w:t>
       </w:r>
       <w:r>
         <w:rPr>
@@ -5382,7 +5391,7 @@
         <w:t xml:space="preserve">HOXC10</w:t>
       </w:r>
       <w:r>
-        <w:t xml:space="preserve">内含子的195 bp重复与头部</w:t>
+        <w:t xml:space="preserve">内含子的197 bp重复与头部</w:t>
       </w:r>
       <w:r>
         <w:rPr>
@@ -5436,7 +5445,7 @@
         <w:t xml:space="preserve">[120,121]</w:t>
       </w:r>
       <w:r>
-        <w:t xml:space="preserve">。44个品种的517只纤维黑色素沉着鸡共享</w:t>
+        <w:t xml:space="preserve">。44个群体的517只纤维黑色素沉着鸡共享</w:t>
       </w:r>
       <w:r>
         <w:rPr>

</xml_diff>

<commit_message>
Section 3 review edits: split paragraphs, Hata explanation, trim overlap with section 7, unify terms
</commit_message>
<xml_diff>
--- a/3-7_v12_clean.docx
+++ b/3-7_v12_clean.docx
@@ -164,33 +164,6 @@
         <w:t xml:space="preserve">[6]</w:t>
       </w:r>
       <w:r>
-        <w:t xml:space="preserve">。印度的独立驯化主张同样主要依据母系资料。印度家鸡与不同的红原鸡群体共享单倍型</w:t>
-      </w:r>
-      <w:r>
-        <w:rPr>
-          <w:vertAlign w:val="superscript"/>
-        </w:rPr>
-        <w:t xml:space="preserve">[7]</w:t>
-      </w:r>
-      <w:r>
-        <w:t xml:space="preserve">。另一项研究比较了印度6个地方品种和圈养红原鸡的完整线粒体序列，发现印度红原鸡与家鸡在系统树上分开；作者结合只含印度样本的分组，提出了独立驯化的解释</w:t>
-      </w:r>
-      <w:r>
-        <w:rPr>
-          <w:vertAlign w:val="superscript"/>
-        </w:rPr>
-        <w:t xml:space="preserve">[8]</w:t>
-      </w:r>
-      <w:r>
-        <w:t xml:space="preserve">。不过，该研究的每组样本都是5只个体的混合样本，也没有比较“独立驯化”与“家鸡传入后杂交”这两种情景；其系统树上的A～F分组，也未与常用的母系单倍群体系对应起来</w:t>
-      </w:r>
-      <w:r>
-        <w:rPr>
-          <w:vertAlign w:val="superscript"/>
-        </w:rPr>
-        <w:t xml:space="preserve">[8]</w:t>
-      </w:r>
-      <w:r>
         <w:t xml:space="preserve">。</w:t>
       </w:r>
     </w:p>
@@ -199,22 +172,31 @@
         <w:jc w:val="both"/>
       </w:pPr>
       <w:r>
-        <w:t xml:space="preserve">后续研究显示，驯化后的育种和传播也会影响母系分布。C1亚单倍群和A单倍群在黄淮流域多样性较高，并在东亚斗鸡中富集，其较晚的扩张可能与斗鸡的育种和传播有关</w:t>
+        <w:t xml:space="preserve">印度的独立驯化主张同样主要依据母系资料。控制区序列比较显示，印度家鸡与不同的红原鸡群体共享单倍型</w:t>
       </w:r>
       <w:r>
         <w:rPr>
           <w:vertAlign w:val="superscript"/>
         </w:rPr>
-        <w:t xml:space="preserve">[9]</w:t>
-      </w:r>
-      <w:r>
-        <w:t xml:space="preserve">。在完整序列比较中，一只日本德地地鸡的D单倍群序列归入D2亚单倍群，而东南亚岛屿和太平洋样本的D单倍群序列归入D1亚单倍群。研究者由此把日本这一母系联系到中国北方及邻近地区；不过，该研究中的D2样本只有日本和新疆各1只</w:t>
+        <w:t xml:space="preserve">[7]</w:t>
+      </w:r>
+      <w:r>
+        <w:t xml:space="preserve">。另一项研究比较了印度6个地方品种和圈养红原鸡的完整线粒体序列，发现印度红原鸡与家鸡在系统树上分开；作者结合只含印度样本的分组，提出了独立驯化的解释</w:t>
       </w:r>
       <w:r>
         <w:rPr>
           <w:vertAlign w:val="superscript"/>
         </w:rPr>
-        <w:t xml:space="preserve">[10]</w:t>
+        <w:t xml:space="preserve">[8]</w:t>
+      </w:r>
+      <w:r>
+        <w:t xml:space="preserve">。不过，该研究的每组样本都是5只个体的混合样本，也没有比较“独立驯化”与“家鸡传入后杂交”这两种情景；其系统树上的A～F分组，也未与常用的母系单倍群体系对应起来</w:t>
+      </w:r>
+      <w:r>
+        <w:rPr>
+          <w:vertAlign w:val="superscript"/>
+        </w:rPr>
+        <w:t xml:space="preserve">[8]</w:t>
       </w:r>
       <w:r>
         <w:t xml:space="preserve">。</w:t>
@@ -225,13 +207,22 @@
         <w:jc w:val="both"/>
       </w:pPr>
       <w:r>
-        <w:t xml:space="preserve">线粒体资料确立了家鸡与红原鸡的主要母系联系。祖先母系变异的保留和驯化后的杂交，共同塑造了家鸡的母系多样性；选择和性别偏向的基因交流，还可使母系亲缘关系与核基因组亲缘关系不一致</w:t>
+        <w:t xml:space="preserve">后续研究显示，驯化后的育种和传播也会影响母系分布。C1亚单倍群和A单倍群在黄淮流域多样性较高，并在东亚斗鸡中富集，其较晚的扩张可能与斗鸡的育种和传播有关</w:t>
       </w:r>
       <w:r>
         <w:rPr>
           <w:vertAlign w:val="superscript"/>
         </w:rPr>
-        <w:t xml:space="preserve">[11,12]</w:t>
+        <w:t xml:space="preserve">[9]</w:t>
+      </w:r>
+      <w:r>
+        <w:t xml:space="preserve">。在完整序列比较中，一只日本德地地鸡的D单倍群序列归入D2亚单倍群，而东南亚岛屿和太平洋样本的D单倍群序列归入D1亚单倍群。研究者由此把日本这一母系联系到中国北方及邻近地区；不过，该研究中的D2样本只有日本和新疆各1只</w:t>
+      </w:r>
+      <w:r>
+        <w:rPr>
+          <w:vertAlign w:val="superscript"/>
+        </w:rPr>
+        <w:t xml:space="preserve">[10]</w:t>
       </w:r>
       <w:r>
         <w:t xml:space="preserve">。</w:t>
@@ -239,99 +230,27 @@
     </w:p>
     <w:p>
       <w:pPr>
-        <w:pStyle w:val="Heading2"/>
-      </w:pPr>
-      <w:r>
-        <w:t xml:space="preserve">3.2 核遗传证据与主要祖先群体</w:t>
+        <w:jc w:val="both"/>
+      </w:pPr>
+      <w:r>
+        <w:t xml:space="preserve">线粒体资料确立了家鸡与红原鸡的主要母系联系。祖先母系变异的保留和驯化后的杂交，共同塑造了家鸡的母系多样性；选择和性别偏向的基因交流，还可使母系亲缘关系与核基因组亲缘关系不一致</w:t>
+      </w:r>
+      <w:r>
+        <w:rPr>
+          <w:vertAlign w:val="superscript"/>
+        </w:rPr>
+        <w:t xml:space="preserve">[11,12]</w:t>
+      </w:r>
+      <w:r>
+        <w:t xml:space="preserve">。因此，母系单倍群的地理分布本身不足以判断驯化的次数和地点。</w:t>
       </w:r>
     </w:p>
     <w:p>
       <w:pPr>
-        <w:jc w:val="both"/>
-      </w:pPr>
-      <w:r>
-        <w:t xml:space="preserve">核DNA由父母双方传递。跨群体比较和群体历史分析可以区分祖先变异的保留与后期基因交流，从而补充对母系来源的判断。基于少数亚种和区域样本的比较，得到的亲缘结果并不一致。微卫星分析显示，中国地方鸡与中国</w:t>
-      </w:r>
-      <w:r>
-        <w:rPr>
-          <w:i/>
-        </w:rPr>
-        <w:t xml:space="preserve">G. g. spadiceus</w:t>
-      </w:r>
-      <w:r>
-        <w:t xml:space="preserve">的亲缘关系，比与泰国</w:t>
-      </w:r>
-      <w:r>
-        <w:rPr>
-          <w:i/>
-        </w:rPr>
-        <w:t xml:space="preserve">G. g. gallus</w:t>
-      </w:r>
-      <w:r>
-        <w:t xml:space="preserve">更近</w:t>
-      </w:r>
-      <w:r>
-        <w:rPr>
-          <w:vertAlign w:val="superscript"/>
-        </w:rPr>
-        <w:t xml:space="preserve">[13]</w:t>
-      </w:r>
-      <w:r>
-        <w:t xml:space="preserve">。另一项研究在泰国11个保护中心采集了12个红原鸡群体（298只，含</w:t>
-      </w:r>
-      <w:r>
-        <w:rPr>
-          <w:i/>
-        </w:rPr>
-        <w:t xml:space="preserve">G. g. gallus</w:t>
-      </w:r>
-      <w:r>
-        <w:t xml:space="preserve">和</w:t>
-      </w:r>
-      <w:r>
-        <w:rPr>
-          <w:i/>
-        </w:rPr>
-        <w:t xml:space="preserve">G. g. spadiceus</w:t>
-      </w:r>
-      <w:r>
-        <w:t xml:space="preserve">），并与10个泰国地方鸡品种（138只）作微卫星比较。结果未能清楚区分两个红原鸡亚种，家鸡与</w:t>
-      </w:r>
-      <w:r>
-        <w:rPr>
-          <w:i/>
-        </w:rPr>
-        <w:t xml:space="preserve">G. g. spadiceus</w:t>
-      </w:r>
-      <w:r>
-        <w:t xml:space="preserve">的亲缘关系也不比与</w:t>
-      </w:r>
-      <w:r>
-        <w:rPr>
-          <w:i/>
-        </w:rPr>
-        <w:t xml:space="preserve">G. g. gallus</w:t>
-      </w:r>
-      <w:r>
-        <w:t xml:space="preserve">更近。这些红原鸡群体的遗传多样性较高；作者结合红原鸡中特有的母系变异，推测驯化只涉及红原鸡的部分基因库。亚洲其他地区所见的部分线粒体单倍群，未在这些泰国样本中出现，作者据此提出东南亚多地独立驯化的解释</w:t>
-      </w:r>
-      <w:r>
-        <w:rPr>
-          <w:vertAlign w:val="superscript"/>
-        </w:rPr>
-        <w:t xml:space="preserve">[14]</w:t>
-      </w:r>
-      <w:r>
-        <w:t xml:space="preserve">。25个核基因座的30个内含子序列分析，将家鸡与红原鸡共享的单倍型解释为祖先多态保留和后期渗入共同作用的结果；模型估计两者于58,000±16,000年前分化，远早于考古记录的驯化年代</w:t>
-      </w:r>
-      <w:r>
-        <w:rPr>
-          <w:vertAlign w:val="superscript"/>
-        </w:rPr>
-        <w:t xml:space="preserve">[15]</w:t>
-      </w:r>
-      <w:r>
-        <w:t xml:space="preserve">。</w:t>
+        <w:pStyle w:val="Heading2"/>
+      </w:pPr>
+      <w:r>
+        <w:t xml:space="preserve">3.2 核遗传证据与主要祖先群体</w:t>
       </w:r>
     </w:p>
     <w:p>
@@ -339,25 +258,52 @@
         <w:jc w:val="both"/>
       </w:pPr>
       <w:r>
-        <w:t xml:space="preserve">在覆盖原鸡属各物种的全基因组比较中，红原鸡是家鸡的主要祖先物种，其他物种的贡献以渗入形式存在，其中家鸡与灰原鸡之间的双向渗入较为广泛（见第3.3节）</w:t>
+        <w:t xml:space="preserve">核DNA由父母双方传递。跨群体比较和群体历史分析可以区分祖先变异的保留与后期基因交流，从而补充对母系来源的判断。基于少数亚种和区域样本的比较，得到的亲缘结果并不一致。微卫星分析显示，中国地方鸡与中国</w:t>
+      </w:r>
+      <w:r>
+        <w:rPr>
+          <w:i/>
+        </w:rPr>
+        <w:t xml:space="preserve">G. g. spadiceus</w:t>
+      </w:r>
+      <w:r>
+        <w:t xml:space="preserve">的亲缘关系，比与泰国</w:t>
+      </w:r>
+      <w:r>
+        <w:rPr>
+          <w:i/>
+        </w:rPr>
+        <w:t xml:space="preserve">G. g. gallus</w:t>
+      </w:r>
+      <w:r>
+        <w:t xml:space="preserve">更近</w:t>
       </w:r>
       <w:r>
         <w:rPr>
           <w:vertAlign w:val="superscript"/>
         </w:rPr>
-        <w:t xml:space="preserve">[16]</w:t>
-      </w:r>
-      <w:r>
-        <w:t xml:space="preserve">。覆盖红原鸡全部5个亚种的863个基因组，进一步把主要祖源定位到</w:t>
+        <w:t xml:space="preserve">[13]</w:t>
+      </w:r>
+      <w:r>
+        <w:t xml:space="preserve">。另一项研究在泰国11个保护中心采集了12个红原鸡群体（298只，含</w:t>
       </w:r>
       <w:r>
         <w:rPr>
           <w:i/>
         </w:rPr>
+        <w:t xml:space="preserve">G. g. gallus</w:t>
+      </w:r>
+      <w:r>
+        <w:t xml:space="preserve">和</w:t>
+      </w:r>
+      <w:r>
+        <w:rPr>
+          <w:i/>
+        </w:rPr>
         <w:t xml:space="preserve">G. g. spadiceus</w:t>
       </w:r>
       <w:r>
-        <w:t xml:space="preserve">：696只家鸡中，除2只外都与部分</w:t>
+        <w:t xml:space="preserve">），并与10个泰国地方鸡品种（138只）作微卫星比较。结果未能清楚区分两个红原鸡亚种，家鸡与</w:t>
       </w:r>
       <w:r>
         <w:rPr>
@@ -366,46 +312,31 @@
         <w:t xml:space="preserve">G. g. spadiceus</w:t>
       </w:r>
       <w:r>
-        <w:t xml:space="preserve">个体构成单系群；群体结构、等位基因共享和群体混合图（TreeMix）</w:t>
+        <w:t xml:space="preserve">的亲缘关系也不比与</w:t>
+      </w:r>
+      <w:r>
+        <w:rPr>
+          <w:i/>
+        </w:rPr>
+        <w:t xml:space="preserve">G. g. gallus</w:t>
+      </w:r>
+      <w:r>
+        <w:t xml:space="preserve">更近；作者认为，这与两项研究的亚种采样地点不同有关。这些红原鸡群体的遗传多样性较高；作者结合红原鸡中特有的母系变异，推测驯化只涉及红原鸡的部分基因库。该研究还依据亚洲其他地区所见的部分线粒体单倍群未在这些泰国样本中出现，提出东南亚多地独立驯化的解释</w:t>
       </w:r>
       <w:r>
         <w:rPr>
           <w:vertAlign w:val="superscript"/>
         </w:rPr>
-        <w:t xml:space="preserve">[17]</w:t>
-      </w:r>
-      <w:r>
-        <w:t xml:space="preserve">分析也都指向</w:t>
-      </w:r>
-      <w:r>
-        <w:rPr>
-          <w:i/>
-        </w:rPr>
-        <w:t xml:space="preserve">G. g. spadiceus</w:t>
+        <w:t xml:space="preserve">[14]</w:t>
+      </w:r>
+      <w:r>
+        <w:t xml:space="preserve">。25个核基因座的30个内含子序列分析，将家鸡与红原鸡共享的单倍型解释为祖先多态保留和后期渗入共同作用的结果；模型估计两者于58,000±16,000年前分化，远早于考古记录的驯化年代</w:t>
       </w:r>
       <w:r>
         <w:rPr>
           <w:vertAlign w:val="superscript"/>
         </w:rPr>
-        <w:t xml:space="preserve">[18]</w:t>
-      </w:r>
-      <w:r>
-        <w:t xml:space="preserve">。约一个世纪前的历史</w:t>
-      </w:r>
-      <w:r>
-        <w:rPr>
-          <w:i/>
-        </w:rPr>
-        <w:t xml:space="preserve">G. g. spadiceus</w:t>
-      </w:r>
-      <w:r>
-        <w:t xml:space="preserve">标本，同样比其他亚种更接近家鸡，支持了现生基因组得出的主要祖源判断</w:t>
-      </w:r>
-      <w:r>
-        <w:rPr>
-          <w:vertAlign w:val="superscript"/>
-        </w:rPr>
-        <w:t xml:space="preserve">[19]</w:t>
+        <w:t xml:space="preserve">[15]</w:t>
       </w:r>
       <w:r>
         <w:t xml:space="preserve">。</w:t>
@@ -416,7 +347,16 @@
         <w:jc w:val="both"/>
       </w:pPr>
       <w:r>
-        <w:t xml:space="preserve">驯化以后，家鸡在传播和育种中继续与其他亚种、品种发生基因交流。全基因组研究比较了印度鸡来源的两种情景：一是</w:t>
+        <w:t xml:space="preserve">在覆盖原鸡属各物种的全基因组比较中，红原鸡是家鸡的主要祖先物种，其他物种的贡献以渗入形式存在，其中家鸡与灰原鸡之间的双向渗入较为广泛（见第3.3节）</w:t>
+      </w:r>
+      <w:r>
+        <w:rPr>
+          <w:vertAlign w:val="superscript"/>
+        </w:rPr>
+        <w:t xml:space="preserve">[16]</w:t>
+      </w:r>
+      <w:r>
+        <w:t xml:space="preserve">。覆盖红原鸡全部5个亚种的863个基因组，进一步把主要祖源定位到</w:t>
       </w:r>
       <w:r>
         <w:rPr>
@@ -425,115 +365,67 @@
         <w:t xml:space="preserve">G. g. spadiceus</w:t>
       </w:r>
       <w:r>
-        <w:t xml:space="preserve">来源的鸡群传入印度后，吸收了当地</w:t>
+        <w:t xml:space="preserve">：696只家鸡中，除2只外都与部分</w:t>
       </w:r>
       <w:r>
         <w:rPr>
           <w:i/>
         </w:rPr>
+        <w:t xml:space="preserve">G. g. spadiceus</w:t>
+      </w:r>
+      <w:r>
+        <w:t xml:space="preserve">个体构成单系群；群体结构、等位基因共享和群体混合图（TreeMix）</w:t>
+      </w:r>
+      <w:r>
+        <w:rPr>
+          <w:vertAlign w:val="superscript"/>
+        </w:rPr>
+        <w:t xml:space="preserve">[17]</w:t>
+      </w:r>
+      <w:r>
+        <w:t xml:space="preserve">分析也都指向</w:t>
+      </w:r>
+      <w:r>
+        <w:rPr>
+          <w:i/>
+        </w:rPr>
+        <w:t xml:space="preserve">G. g. spadiceus</w:t>
+      </w:r>
+      <w:r>
+        <w:rPr>
+          <w:vertAlign w:val="superscript"/>
+        </w:rPr>
+        <w:t xml:space="preserve">[18]</w:t>
+      </w:r>
+      <w:r>
+        <w:t xml:space="preserve">。约一个世纪前的历史标本中，红原鸡各亚种呈现由印度</w:t>
+      </w:r>
+      <w:r>
+        <w:rPr>
+          <w:i/>
+        </w:rPr>
         <w:t xml:space="preserve">G. g. murghi</w:t>
       </w:r>
       <w:r>
-        <w:t xml:space="preserve">的变异；二是</w:t>
+        <w:t xml:space="preserve">到东南亚</w:t>
       </w:r>
       <w:r>
         <w:rPr>
           <w:i/>
         </w:rPr>
-        <w:t xml:space="preserve">G. g. murghi</w:t>
-      </w:r>
-      <w:r>
-        <w:t xml:space="preserve">先被独立驯化，其后代再被外来鸡群大量替代。印度鸡与</w:t>
-      </w:r>
-      <w:r>
-        <w:rPr>
-          <w:i/>
-        </w:rPr>
-        <w:t xml:space="preserve">G. g. murghi</w:t>
-      </w:r>
-      <w:r>
-        <w:t xml:space="preserve">共享的单倍型片段，长于与</w:t>
-      </w:r>
-      <w:r>
-        <w:rPr>
-          <w:i/>
-        </w:rPr>
         <w:t xml:space="preserve">G. g. spadiceus</w:t>
       </w:r>
       <w:r>
-        <w:t xml:space="preserve">共享的片段，群体历史模型也更支持第一种情景</w:t>
+        <w:t xml:space="preserve">的渐变结构，后者更接近家鸡，支持了现生基因组得出的主要祖源判断</w:t>
       </w:r>
       <w:r>
         <w:rPr>
           <w:vertAlign w:val="superscript"/>
         </w:rPr>
-        <w:t xml:space="preserve">[18]</w:t>
-      </w:r>
-      <w:r>
-        <w:t xml:space="preserve">。在多国商业白来航样本中，</w:t>
-      </w:r>
-      <w:r>
-        <w:rPr>
-          <w:i/>
-        </w:rPr>
-        <w:t xml:space="preserve">G. g. murghi</w:t>
-      </w:r>
-      <w:r>
-        <w:t xml:space="preserve">祖源约占25%；印度尼西亚鸡含</w:t>
-      </w:r>
-      <w:r>
-        <w:rPr>
-          <w:i/>
-        </w:rPr>
-        <w:t xml:space="preserve">G. g. bankiva</w:t>
-      </w:r>
-      <w:r>
-        <w:t xml:space="preserve">和</w:t>
-      </w:r>
-      <w:r>
-        <w:rPr>
-          <w:i/>
-        </w:rPr>
-        <w:t xml:space="preserve">G. g. gallus</w:t>
-      </w:r>
-      <w:r>
-        <w:t xml:space="preserve">相关祖源，中国鸡含</w:t>
-      </w:r>
-      <w:r>
-        <w:rPr>
-          <w:i/>
-        </w:rPr>
-        <w:t xml:space="preserve">G. g. jabouillei</w:t>
-      </w:r>
-      <w:r>
-        <w:t xml:space="preserve">相关祖源</w:t>
-      </w:r>
-      <w:r>
-        <w:rPr>
-          <w:vertAlign w:val="superscript"/>
-        </w:rPr>
-        <w:t xml:space="preserve">[18]</w:t>
-      </w:r>
-      <w:r>
-        <w:t xml:space="preserve">。交流也发生在相反方向。印度57只野生红原鸡与79只邻近家鸡的比较识别出混合个体，二者共享母系单倍型的频率提示家鸡向野生群体输入了遗传成分</w:t>
-      </w:r>
-      <w:r>
-        <w:rPr>
-          <w:vertAlign w:val="superscript"/>
-        </w:rPr>
-        <w:t xml:space="preserve">[20]</w:t>
-      </w:r>
-      <w:r>
-        <w:t xml:space="preserve">。商业鸡的输入同样改变了地方鸡：8个中国地方品种的基因组中，平均约15%来自商业肉鸡渗入，比例从藏鸡的0.64%到惠阳胡须鸡的21.52%不等</w:t>
-      </w:r>
-      <w:r>
-        <w:rPr>
-          <w:vertAlign w:val="superscript"/>
-        </w:rPr>
-        <w:t xml:space="preserve">[21]</w:t>
-      </w:r>
-      <w:r>
-        <w:t xml:space="preserve">。因此，现代鸡群的亲缘关系是主要祖源与后期交流共同作用的结果。</w:t>
+        <w:t xml:space="preserve">[19]</w:t>
+      </w:r>
+      <w:r>
+        <w:t xml:space="preserve">。</w:t>
       </w:r>
     </w:p>
     <w:p>
@@ -541,7 +433,7 @@
         <w:jc w:val="both"/>
       </w:pPr>
       <w:r>
-        <w:t xml:space="preserve">全基因组比较和历史标本资料支持</w:t>
+        <w:t xml:space="preserve">驯化以后，家鸡在传播和育种中继续吸收其他亚种的遗传成分。全基因组研究比较了印度鸡来源的两种情景：一是</w:t>
       </w:r>
       <w:r>
         <w:rPr>
@@ -550,41 +442,157 @@
         <w:t xml:space="preserve">G. g. spadiceus</w:t>
       </w:r>
       <w:r>
-        <w:t xml:space="preserve">相关群体为家鸡的主要祖先</w:t>
+        <w:t xml:space="preserve">来源的鸡群传入印度后，吸收了当地</w:t>
+      </w:r>
+      <w:r>
+        <w:rPr>
+          <w:i/>
+        </w:rPr>
+        <w:t xml:space="preserve">G. g. murghi</w:t>
+      </w:r>
+      <w:r>
+        <w:t xml:space="preserve">的变异；二是</w:t>
+      </w:r>
+      <w:r>
+        <w:rPr>
+          <w:i/>
+        </w:rPr>
+        <w:t xml:space="preserve">G. g. murghi</w:t>
+      </w:r>
+      <w:r>
+        <w:t xml:space="preserve">先被独立驯化，其后代再被外来鸡群大量替代。印度鸡与</w:t>
+      </w:r>
+      <w:r>
+        <w:rPr>
+          <w:i/>
+        </w:rPr>
+        <w:t xml:space="preserve">G. g. murghi</w:t>
+      </w:r>
+      <w:r>
+        <w:t xml:space="preserve">共享的单倍型片段，长于与</w:t>
+      </w:r>
+      <w:r>
+        <w:rPr>
+          <w:i/>
+        </w:rPr>
+        <w:t xml:space="preserve">G. g. spadiceus</w:t>
+      </w:r>
+      <w:r>
+        <w:t xml:space="preserve">共享的片段，群体历史模型也更支持第一种情景</w:t>
       </w:r>
       <w:r>
         <w:rPr>
           <w:vertAlign w:val="superscript"/>
         </w:rPr>
-        <w:t xml:space="preserve">[18,19]</w:t>
-      </w:r>
-      <w:r>
-        <w:t xml:space="preserve">。因此，家鸡中多个具有地域差异的母系单倍群，与共同的主要核祖源并不矛盾。</w:t>
+        <w:t xml:space="preserve">[18]</w:t>
+      </w:r>
+      <w:r>
+        <w:t xml:space="preserve">。在多国商业白来航样本中，</w:t>
       </w:r>
       <w:r>
         <w:rPr>
           <w:i/>
         </w:rPr>
-        <w:t xml:space="preserve">G. g. spadiceus</w:t>
-      </w:r>
-      <w:r>
-        <w:t xml:space="preserve">内部有多少群体参与了驯化、驯化发生在哪些地点、共发生了几次，仍需结合考古记录判断（见第4节）。</w:t>
+        <w:t xml:space="preserve">G. g. murghi</w:t>
+      </w:r>
+      <w:r>
+        <w:t xml:space="preserve">祖源约占25%；印度尼西亚鸡含</w:t>
+      </w:r>
+      <w:r>
+        <w:rPr>
+          <w:i/>
+        </w:rPr>
+        <w:t xml:space="preserve">G. g. bankiva</w:t>
+      </w:r>
+      <w:r>
+        <w:t xml:space="preserve">和</w:t>
+      </w:r>
+      <w:r>
+        <w:rPr>
+          <w:i/>
+        </w:rPr>
+        <w:t xml:space="preserve">G. g. gallus</w:t>
+      </w:r>
+      <w:r>
+        <w:t xml:space="preserve">相关祖源，中国鸡含</w:t>
+      </w:r>
+      <w:r>
+        <w:rPr>
+          <w:i/>
+        </w:rPr>
+        <w:t xml:space="preserve">G. g. jabouillei</w:t>
+      </w:r>
+      <w:r>
+        <w:t xml:space="preserve">相关祖源</w:t>
+      </w:r>
+      <w:r>
+        <w:rPr>
+          <w:vertAlign w:val="superscript"/>
+        </w:rPr>
+        <w:t xml:space="preserve">[18]</w:t>
+      </w:r>
+      <w:r>
+        <w:t xml:space="preserve">。家鸡向野生红原鸡、商业鸡向地方鸡的近期输入也已检出（见第7节）</w:t>
+      </w:r>
+      <w:r>
+        <w:rPr>
+          <w:vertAlign w:val="superscript"/>
+        </w:rPr>
+        <w:t xml:space="preserve">[20,21]</w:t>
+      </w:r>
+      <w:r>
+        <w:t xml:space="preserve">。因此，现代鸡群的亲缘关系是主要祖源与后期交流共同作用的结果。</w:t>
       </w:r>
     </w:p>
     <w:p>
       <w:pPr>
-        <w:pStyle w:val="Heading2"/>
-      </w:pPr>
-      <w:r>
-        <w:t xml:space="preserve">3.3 其他原鸡物种的遗传贡献</w:t>
+        <w:jc w:val="both"/>
+      </w:pPr>
+      <w:r>
+        <w:t xml:space="preserve">全基因组比较和历史标本资料支持</w:t>
+      </w:r>
+      <w:r>
+        <w:rPr>
+          <w:i/>
+        </w:rPr>
+        <w:t xml:space="preserve">G. g. spadiceus</w:t>
+      </w:r>
+      <w:r>
+        <w:t xml:space="preserve">相关群体为家鸡的主要祖源</w:t>
+      </w:r>
+      <w:r>
+        <w:rPr>
+          <w:vertAlign w:val="superscript"/>
+        </w:rPr>
+        <w:t xml:space="preserve">[18,19]</w:t>
+      </w:r>
+      <w:r>
+        <w:t xml:space="preserve">。因此，家鸡中多个具有地域差异的母系单倍群，与共同的主要祖源并不矛盾。</w:t>
+      </w:r>
+      <w:r>
+        <w:rPr>
+          <w:i/>
+        </w:rPr>
+        <w:t xml:space="preserve">G. g. spadiceus</w:t>
+      </w:r>
+      <w:r>
+        <w:t xml:space="preserve">内部有多少群体参与了驯化、驯化发生在哪些地点、共发生了几次，仍需结合考古记录判断（见第4节）。</w:t>
       </w:r>
     </w:p>
     <w:p>
       <w:pPr>
+        <w:pStyle w:val="Heading2"/>
+      </w:pPr>
+      <w:r>
+        <w:t xml:space="preserve">3.3 其他原鸡物种的遗传贡献</w:t>
+      </w:r>
+    </w:p>
+    <w:p>
+      <w:pPr>
         <w:jc w:val="both"/>
       </w:pPr>
       <w:r>
-        <w:t xml:space="preserve">其他原鸡物种对家鸡的贡献以局部核片段为主。最清楚的实例是黄色皮肤。该性状被定位到包含</w:t>
+        <w:t xml:space="preserve">其他原鸡物种对家鸡的贡献以局部核片段为主，其中灰原鸡的贡献最为明确。最清楚的实例是黄色皮肤。该性状被定位到包含</w:t>
       </w:r>
       <w:r>
         <w:rPr>
@@ -674,7 +682,15 @@
         <w:t xml:space="preserve">[24,25]</w:t>
       </w:r>
       <w:r>
-        <w:t xml:space="preserve">。斯里兰卡原鸡（</w:t>
+        <w:t xml:space="preserve">。</w:t>
+      </w:r>
+    </w:p>
+    <w:p>
+      <w:pPr>
+        <w:jc w:val="both"/>
+      </w:pPr>
+      <w:r>
+        <w:t xml:space="preserve">斯里兰卡原鸡（</w:t>
       </w:r>
       <w:r>
         <w:rPr>
@@ -692,7 +708,7 @@
         <w:t xml:space="preserve">G. varius</w:t>
       </w:r>
       <w:r>
-        <w:t xml:space="preserve">）的核片段实例较少。斯里兰卡地方鸡的线粒体比较，未显示斯里兰卡原鸡的母系贡献</w:t>
+        <w:t xml:space="preserve">）的核片段实例较少。斯里兰卡地方鸡的母系与红原鸡、灰原鸡更近，而与斯里兰卡原鸡较远</w:t>
       </w:r>
       <w:r>
         <w:rPr>

</xml_diff>

<commit_message>
Section 4 review edits
</commit_message>
<xml_diff>
--- a/3-7_v12_clean.docx
+++ b/3-7_v12_clean.docx
@@ -847,16 +847,34 @@
         <w:jc w:val="both"/>
       </w:pPr>
       <w:r>
-        <w:t xml:space="preserve">泰国Ban Non Wat发现了候选鸡骨</w:t>
+        <w:t xml:space="preserve">目前最早的明确家鸡记录来自泰国Ban Non Wat：一项全球综合评估将该遗址约公元前1650～1250年的遗存列为最早的明确家鸡记录</w:t>
       </w:r>
       <w:r>
         <w:rPr>
           <w:vertAlign w:val="superscript"/>
         </w:rPr>
+        <w:t xml:space="preserve">[37]</w:t>
+      </w:r>
+      <w:r>
+        <w:t xml:space="preserve">，这一年代对应遗址的新石器1期</w:t>
+      </w:r>
+      <w:r>
+        <w:rPr>
+          <w:vertAlign w:val="superscript"/>
+        </w:rPr>
+        <w:t xml:space="preserve">[40]</w:t>
+      </w:r>
+      <w:r>
+        <w:t xml:space="preserve">；该遗址发现了候选鸡骨</w:t>
+      </w:r>
+      <w:r>
+        <w:rPr>
+          <w:vertAlign w:val="superscript"/>
+        </w:rPr>
         <w:t xml:space="preserve">[38]</w:t>
       </w:r>
       <w:r>
-        <w:t xml:space="preserve">，该遗址较晚阶段遗存的古线粒体序列也确认了原鸡属身份</w:t>
+        <w:t xml:space="preserve">，较晚阶段遗存的古线粒体序列也确认了原鸡属身份</w:t>
       </w:r>
       <w:r>
         <w:rPr>
@@ -865,79 +883,61 @@
         <w:t xml:space="preserve">[39]</w:t>
       </w:r>
       <w:r>
-        <w:t xml:space="preserve">。一项全球综合评估将该遗址约公元前1650～1250年的遗存列为最早的明确家鸡记录</w:t>
+        <w:t xml:space="preserve">。云南菜园子和大墩子的鸡骨年代可能更早，有研究据此主张把云南纳入驯化区域</w:t>
       </w:r>
       <w:r>
         <w:rPr>
           <w:vertAlign w:val="superscript"/>
         </w:rPr>
-        <w:t xml:space="preserve">[37]</w:t>
-      </w:r>
-      <w:r>
-        <w:t xml:space="preserve">，这一年代对应遗址的新石器1期</w:t>
+        <w:t xml:space="preserve">[41]</w:t>
+      </w:r>
+      <w:r>
+        <w:t xml:space="preserve">。但是，菜园子的鸡骨缺少可复核的形态描述，大墩子的标本在原报告中则被列为可能家养，因此二者目前仍作为候选记录</w:t>
       </w:r>
       <w:r>
         <w:rPr>
           <w:vertAlign w:val="superscript"/>
         </w:rPr>
-        <w:t xml:space="preserve">[40]</w:t>
-      </w:r>
-      <w:r>
-        <w:t xml:space="preserve">。云南菜园子和大墩子的鸡骨年代可能更早，有研究据此主张把云南纳入驯化区域</w:t>
+        <w:t xml:space="preserve">[42]</w:t>
+      </w:r>
+      <w:r>
+        <w:t xml:space="preserve">。上述泰国和云南地点都位于</w:t>
+      </w:r>
+      <w:r>
+        <w:rPr>
+          <w:i/>
+        </w:rPr>
+        <w:t xml:space="preserve">G. g. spadiceus</w:t>
+      </w:r>
+      <w:r>
+        <w:t xml:space="preserve">现今的分布区（中国西南、泰国北部和缅甸）内或其附近，与遗传证据指向的区域相接</w:t>
       </w:r>
       <w:r>
         <w:rPr>
           <w:vertAlign w:val="superscript"/>
         </w:rPr>
-        <w:t xml:space="preserve">[41]</w:t>
-      </w:r>
-      <w:r>
-        <w:t xml:space="preserve">。但是，菜园子的鸡骨缺少可复核的形态描述，大墩子的标本在原报告中则被列为可能家养，因此二者目前仍作为候选记录</w:t>
+        <w:t xml:space="preserve">[18]</w:t>
+      </w:r>
+      <w:r>
+        <w:t xml:space="preserve">。遗传分化年代早于所有考古记录：多重序列马尔可夫溯祖模型（MSMC）估计，家鸡与</w:t>
+      </w:r>
+      <w:r>
+        <w:rPr>
+          <w:i/>
+        </w:rPr>
+        <w:t xml:space="preserve">G. g. spadiceus</w:t>
+      </w:r>
+      <w:r>
+        <w:t xml:space="preserve">约在（9500±3300）年前分化</w:t>
       </w:r>
       <w:r>
         <w:rPr>
           <w:vertAlign w:val="superscript"/>
         </w:rPr>
-        <w:t xml:space="preserve">[42]</w:t>
-      </w:r>
-      <w:r>
-        <w:t xml:space="preserve">。泰国与云南的候选地点都位于</w:t>
-      </w:r>
-      <w:r>
-        <w:rPr>
-          <w:i/>
-        </w:rPr>
-        <w:t xml:space="preserve">G. g. spadiceus</w:t>
-      </w:r>
-      <w:r>
-        <w:t xml:space="preserve">现今的分布区（中国西南、泰国北部和缅甸）内或其附近，与遗传证据指向的区域相接</w:t>
-      </w:r>
-      <w:r>
-        <w:rPr>
-          <w:vertAlign w:val="superscript"/>
-        </w:rPr>
         <w:t xml:space="preserve">[18]</w:t>
       </w:r>
       <w:r>
-        <w:t xml:space="preserve">。多重序列马尔可夫溯祖模型（MSMC）估计，家鸡与</w:t>
-      </w:r>
-      <w:r>
-        <w:rPr>
-          <w:i/>
-        </w:rPr>
-        <w:t xml:space="preserve">G. g. spadiceus</w:t>
-      </w:r>
-      <w:r>
-        <w:t xml:space="preserve">约在（9500±3300）年前分化</w:t>
-      </w:r>
-      <w:r>
-        <w:rPr>
-          <w:vertAlign w:val="superscript"/>
-        </w:rPr>
-        <w:t xml:space="preserve">[18]</w:t>
-      </w:r>
-      <w:r>
-        <w:t xml:space="preserve">；这一节点可能对应开始饲养之前祖先群体的分化。</w:t>
+        <w:t xml:space="preserve">，这一节点可能对应开始饲养之前祖先群体的分化，而不是饲养开始的时间。</w:t>
       </w:r>
     </w:p>
     <w:p>
@@ -953,7 +953,7 @@
         <w:jc w:val="both"/>
       </w:pPr>
       <w:r>
-        <w:t xml:space="preserve">这一带早期家鸡的出现，与稻、粟农业的扩散有关。农业共栖模型认为，稻、粟种植进入原鸡分布区后，开垦和休耕形成的次生灌丛扩大了适宜生境，收获、加工和储藏留下的谷物又提供了食物，原鸡因此反复接近聚落</w:t>
+        <w:t xml:space="preserve">这一带早期家鸡的出现，在时间上与稻、粟农业的扩散相吻合。农业共栖模型认为，稻、粟种植进入原鸡分布区后，开垦和休耕形成的次生灌丛扩大了适宜生境，收获、加工和储藏留下的谷物又提供了食物，原鸡因此反复接近聚落</w:t>
       </w:r>
       <w:r>
         <w:rPr>
@@ -1007,7 +1007,7 @@
         <w:t xml:space="preserve">[35]</w:t>
       </w:r>
       <w:r>
-        <w:t xml:space="preserve">。原鸡还需经过人类的容纳和留养，才能进入持续饲养。图1概括了农业共栖、持续饲养、传播和后续变化之间的联系。</w:t>
+        <w:t xml:space="preserve">。原鸡还需经过人类的容纳和留养，才能进入持续饲养。考古上，判断当地是否已持续饲养，主要看是否出现幼鸟骨和含髓质骨的雌鸟骨，这类证据各地出现得早晚不一（见表1）。图1概括了农业共栖、持续饲养、传播和后续变化之间的联系。</w:t>
       </w:r>
     </w:p>
     <w:p>
@@ -1085,7 +1085,7 @@
         <w:t xml:space="preserve">[37,43]</w:t>
       </w:r>
       <w:r>
-        <w:t xml:space="preserve">。图中四个部分概括的是可以相互重叠的过程，不表示界限分明的年代阶段。家鸡的主要核祖源与</w:t>
+        <w:t xml:space="preserve">。图中四个部分概括的是可以相互重叠的过程，不表示界限分明的年代阶段。家鸡的主要祖源与</w:t>
       </w:r>
       <w:r>
         <w:rPr>

</xml_diff>

<commit_message>
Keep citation first-appearance order in Ban Non Wat sentence
</commit_message>
<xml_diff>
--- a/3-7_v12_clean.docx
+++ b/3-7_v12_clean.docx
@@ -847,12 +847,30 @@
         <w:jc w:val="both"/>
       </w:pPr>
       <w:r>
-        <w:t xml:space="preserve">目前最早的明确家鸡记录来自泰国Ban Non Wat：一项全球综合评估将该遗址约公元前1650～1250年的遗存列为最早的明确家鸡记录</w:t>
+        <w:t xml:space="preserve">目前最早的明确家鸡记录来自泰国Ban Non Wat：该遗址发现了候选鸡骨</w:t>
       </w:r>
       <w:r>
         <w:rPr>
           <w:vertAlign w:val="superscript"/>
         </w:rPr>
+        <w:t xml:space="preserve">[38]</w:t>
+      </w:r>
+      <w:r>
+        <w:t xml:space="preserve">，较晚阶段遗存的古线粒体序列也确认了原鸡属身份</w:t>
+      </w:r>
+      <w:r>
+        <w:rPr>
+          <w:vertAlign w:val="superscript"/>
+        </w:rPr>
+        <w:t xml:space="preserve">[39]</w:t>
+      </w:r>
+      <w:r>
+        <w:t xml:space="preserve">；一项全球综合评估将该遗址约公元前1650～1250年的遗存列为最早的明确家鸡记录</w:t>
+      </w:r>
+      <w:r>
+        <w:rPr>
+          <w:vertAlign w:val="superscript"/>
+        </w:rPr>
         <w:t xml:space="preserve">[37]</w:t>
       </w:r>
       <w:r>
@@ -863,24 +881,6 @@
           <w:vertAlign w:val="superscript"/>
         </w:rPr>
         <w:t xml:space="preserve">[40]</w:t>
-      </w:r>
-      <w:r>
-        <w:t xml:space="preserve">；该遗址发现了候选鸡骨</w:t>
-      </w:r>
-      <w:r>
-        <w:rPr>
-          <w:vertAlign w:val="superscript"/>
-        </w:rPr>
-        <w:t xml:space="preserve">[38]</w:t>
-      </w:r>
-      <w:r>
-        <w:t xml:space="preserve">，较晚阶段遗存的古线粒体序列也确认了原鸡属身份</w:t>
-      </w:r>
-      <w:r>
-        <w:rPr>
-          <w:vertAlign w:val="superscript"/>
-        </w:rPr>
-        <w:t xml:space="preserve">[39]</w:t>
       </w:r>
       <w:r>
         <w:t xml:space="preserve">。云南菜园子和大墩子的鸡骨年代可能更早，有研究据此主张把云南纳入驯化区域</w:t>

</xml_diff>

<commit_message>
Section 5 review edits
</commit_message>
<xml_diff>
--- a/3-7_v12_clean.docx
+++ b/3-7_v12_clean.docx
@@ -1137,7 +1137,7 @@
         <w:t xml:space="preserve">[48]</w:t>
       </w:r>
       <w:r>
-        <w:t xml:space="preserve">。向南，非洲之角Mezber的鸡骨直接年代为公元前820～595年，研究者将其与南阿拉伯和红海的交流联系起来</w:t>
+        <w:t xml:space="preserve">。向南，非洲之角Mezber的鸡骨直接年代为公元前820～595年，研究者认为，经红海沿岸港口与南阿拉伯的海上交流，可能是鸡传入非洲的早期路线之一</w:t>
       </w:r>
       <w:r>
         <w:rPr>
@@ -1199,7 +1199,7 @@
         <w:t xml:space="preserve">[56,57,58]</w:t>
       </w:r>
       <w:r>
-        <w:t xml:space="preserve">，随后到达夏威夷和Rapa Nui；Niue、夏威夷和Rapa Nui复核所得的22条可重复古鸡母系序列均属D单倍群</w:t>
+        <w:t xml:space="preserve">，夏威夷、Niue和Rapa Nui的古鸡表明，鸡随后到达东波利尼西亚；复核所得的22条可重复古鸡母系序列均属D单倍群</w:t>
       </w:r>
       <w:r>
         <w:rPr>
@@ -1225,7 +1225,7 @@
         <w:t xml:space="preserve">[60]</w:t>
       </w:r>
       <w:r>
-        <w:t xml:space="preserve">；英国较早的鸡多为完整埋葬，并有老龄个体和骨折愈合的记录，说明部分鸡受到长期照护</w:t>
+        <w:t xml:space="preserve">；英国铁器时代的一只成年鸡腿骨骨折已经愈合，提示它受到过照护；研究者认为，这些早期进入北欧的鸡更可能被视为珍稀动物，而非食物</w:t>
       </w:r>
       <w:r>
         <w:rPr>
@@ -1261,7 +1261,7 @@
         <w:t xml:space="preserve">[62]</w:t>
       </w:r>
       <w:r>
-        <w:t xml:space="preserve">。在东亚，C1亚单倍群和A单倍群在斗鸡中富集，其较晚扩张可能与斗鸡的育种和传播有关</w:t>
+        <w:t xml:space="preserve">。在东亚，斗鸡的育种和传播也改变了当地鸡群的母系组成（见第3.1节）</w:t>
       </w:r>
       <w:r>
         <w:rPr>
@@ -4306,35 +4306,16 @@
         <w:ind w:firstLine="0" w:left="0" w:right="0"/>
       </w:pPr>
       <w:r>
-        <w:rPr>
-          <w:rFonts w:ascii="Times New Roman" w:hAnsi="Times New Roman" w:eastAsia="宋体"/>
-          <w:b w:val="0"/>
-          <w:i w:val="0"/>
-          <w:color w:val="000000"/>
-          <w:sz w:val="19"/>
-        </w:rPr>
-        <w:t>cal BP以公元1950年为基准。Nenumbo沿用Peters等所载储库校正区间（95%概率）；Tongoleleka沿用Steadman等原研究对6个个体的加权合并区间，不能视为每个个体均获得同一精确日期</w:t>
-      </w:r>
-      <w:r>
-        <w:rPr>
-          <w:rFonts w:ascii="Times New Roman" w:hAnsi="Times New Roman" w:eastAsia="宋体"/>
-          <w:b w:val="0"/>
-          <w:i w:val="0"/>
-          <w:color w:val="000000"/>
-          <w:sz w:val="19"/>
+        <w:t xml:space="preserve">cal BP以公元1950年为基准。Nenumbo沿用全球综合评估转引的储库校正区间（95%概率）；Tongoleleka沿用原研究对6个个体的加权合并区间，不能视为每个个体均获得同一精确日期</w:t>
+      </w:r>
+      <w:r>
+        <w:rPr>
           <w:vertAlign w:val="superscript"/>
         </w:rPr>
-        <w:t>[37,56]</w:t>
-      </w:r>
-      <w:r>
-        <w:rPr>
-          <w:rFonts w:ascii="Times New Roman" w:hAnsi="Times New Roman" w:eastAsia="宋体"/>
-          <w:b w:val="0"/>
-          <w:i w:val="0"/>
-          <w:color w:val="000000"/>
-          <w:sz w:val="19"/>
-        </w:rPr>
-        <w:t>。</w:t>
+        <w:t xml:space="preserve">[37,56]</w:t>
+      </w:r>
+      <w:r>
+        <w:t xml:space="preserve">。</w:t>
       </w:r>
     </w:p>
     <w:p>

</xml_diff>

<commit_message>
Section 6 review edits: intro, subsection summaries, Marek's disease sentence, TSHR wording
</commit_message>
<xml_diff>
--- a/3-7_v12_clean.docx
+++ b/3-7_v12_clean.docx
@@ -4345,132 +4345,18 @@
     </w:p>
     <w:p>
       <w:pPr>
-        <w:pStyle w:val="Heading2"/>
-      </w:pPr>
-      <w:r>
-        <w:t xml:space="preserve">6.1 环境适应与抗病性</w:t>
+        <w:jc w:val="both"/>
+      </w:pPr>
+      <w:r>
+        <w:t xml:space="preserve">家鸡传播到不同气候和海拔的地区，并被用于食用、产蛋、观赏和斗鸡等不同目的之后，各地鸡群在环境适应和用途性状上逐渐分化。本节先讨论自然环境和病原压力下的适应（6.1），再讨论人工选择下的生长、繁殖、外形和斗鸡性状（6.2）。</w:t>
       </w:r>
     </w:p>
     <w:p>
       <w:pPr>
-        <w:jc w:val="both"/>
-      </w:pPr>
-      <w:r>
-        <w:rPr>
-          <w:b/>
-        </w:rPr>
-        <w:t xml:space="preserve">高海拔适应。</w:t>
-      </w:r>
-      <w:r>
-        <w:t xml:space="preserve">高海拔环境中的低氧直接影响鸡胚发育和孵化。在海拔2900 m的孵化试验中，藏鸡和低地品种矮小鸡的孵化率分别为79.72%和31.69%；补充氧气后，矮小鸡的孵化率上升</w:t>
-      </w:r>
-      <w:r>
-        <w:rPr>
-          <w:vertAlign w:val="superscript"/>
-        </w:rPr>
-        <w:t xml:space="preserve">[72]</w:t>
-      </w:r>
-      <w:r>
-        <w:t xml:space="preserve">。藏鸡的供氧适应涉及血红蛋白的氧结合特性和组织释氧能力。αD珠蛋白Met32Leu变异与较高的氧亲和力相关</w:t>
-      </w:r>
-      <w:r>
-        <w:rPr>
-          <w:vertAlign w:val="superscript"/>
-        </w:rPr>
-        <w:t xml:space="preserve">[73]</w:t>
-      </w:r>
-      <w:r>
-        <w:t xml:space="preserve">；另一项晚期胚胎研究发现，低氧孵化的藏鸡血红蛋白具有更强的协同性和释氧能力</w:t>
-      </w:r>
-      <w:r>
-        <w:rPr>
-          <w:vertAlign w:val="superscript"/>
-        </w:rPr>
-        <w:t xml:space="preserve">[74]</w:t>
-      </w:r>
-      <w:r>
-        <w:t xml:space="preserve">。选择扫描和胚胎转录组研究所涉及的功能主要包括氧运输与缺氧应答（</w:t>
-      </w:r>
-      <w:r>
-        <w:rPr>
-          <w:i/>
-        </w:rPr>
-        <w:t xml:space="preserve">HBAD</w:t>
-      </w:r>
-      <w:r>
-        <w:t xml:space="preserve">、</w:t>
-      </w:r>
-      <w:r>
-        <w:rPr>
-          <w:i/>
-        </w:rPr>
-        <w:t xml:space="preserve">ARNT</w:t>
-      </w:r>
-      <w:r>
-        <w:t xml:space="preserve">）</w:t>
-      </w:r>
-      <w:r>
-        <w:rPr>
-          <w:vertAlign w:val="superscript"/>
-        </w:rPr>
-        <w:t xml:space="preserve">[75,76]</w:t>
-      </w:r>
-      <w:r>
-        <w:t xml:space="preserve">、心肺发育与血管生成（</w:t>
-      </w:r>
-      <w:r>
-        <w:rPr>
-          <w:i/>
-        </w:rPr>
-        <w:t xml:space="preserve">FGFR1</w:t>
-      </w:r>
-      <w:r>
-        <w:t xml:space="preserve">、</w:t>
-      </w:r>
-      <w:r>
-        <w:rPr>
-          <w:i/>
-        </w:rPr>
-        <w:t xml:space="preserve">CTGF</w:t>
-      </w:r>
-      <w:r>
-        <w:t xml:space="preserve">），以及DNA修复和辐射应答（</w:t>
-      </w:r>
-      <w:r>
-        <w:rPr>
-          <w:i/>
-        </w:rPr>
-        <w:t xml:space="preserve">VCP</w:t>
-      </w:r>
-      <w:r>
-        <w:t xml:space="preserve">、</w:t>
-      </w:r>
-      <w:r>
-        <w:rPr>
-          <w:i/>
-        </w:rPr>
-        <w:t xml:space="preserve">FANCG</w:t>
-      </w:r>
-      <w:r>
-        <w:t xml:space="preserve">）</w:t>
-      </w:r>
-      <w:r>
-        <w:rPr>
-          <w:vertAlign w:val="superscript"/>
-        </w:rPr>
-        <w:t xml:space="preserve">[77]</w:t>
-      </w:r>
-      <w:r>
-        <w:t xml:space="preserve">；肝脏的表达差异还集中在脂肪酸代谢、能量生成和谷胱甘肽抗氧化过程</w:t>
-      </w:r>
-      <w:r>
-        <w:rPr>
-          <w:vertAlign w:val="superscript"/>
-        </w:rPr>
-        <w:t xml:space="preserve">[76]</w:t>
-      </w:r>
-      <w:r>
-        <w:t xml:space="preserve">。</w:t>
+        <w:pStyle w:val="Heading2"/>
+      </w:pPr>
+      <w:r>
+        <w:t xml:space="preserve">6.1 环境适应与抗病性</w:t>
       </w:r>
     </w:p>
     <w:p>
@@ -4478,22 +4364,46 @@
         <w:jc w:val="both"/>
       </w:pPr>
       <w:r>
-        <w:t xml:space="preserve">青藏高原和埃塞俄比亚高原地方鸡的选择信号均涉及钙信号通路。早期藏鸡基因组研究在两个遗传群体中发现了这一信号</w:t>
+        <w:rPr>
+          <w:b/>
+        </w:rPr>
+        <w:t xml:space="preserve">高海拔适应。</w:t>
+      </w:r>
+      <w:r>
+        <w:t xml:space="preserve">高海拔环境中的低氧直接影响鸡胚发育和孵化。在海拔2900 m的孵化试验中，藏鸡和低地品种矮小鸡的孵化率分别为79.72%和31.69%；补充氧气后，矮小鸡的孵化率上升</w:t>
       </w:r>
       <w:r>
         <w:rPr>
           <w:vertAlign w:val="superscript"/>
         </w:rPr>
-        <w:t xml:space="preserve">[78]</w:t>
-      </w:r>
-      <w:r>
-        <w:t xml:space="preserve">；埃塞俄比亚26个地方鸡群体、513只鸡的比较也在高海拔群体中检出钙信号通路（</w:t>
+        <w:t xml:space="preserve">[72]</w:t>
+      </w:r>
+      <w:r>
+        <w:t xml:space="preserve">。藏鸡的供氧适应涉及血红蛋白的氧结合特性和组织释氧能力。αD珠蛋白Met32Leu变异与较高的氧亲和力相关</w:t>
+      </w:r>
+      <w:r>
+        <w:rPr>
+          <w:vertAlign w:val="superscript"/>
+        </w:rPr>
+        <w:t xml:space="preserve">[73]</w:t>
+      </w:r>
+      <w:r>
+        <w:t xml:space="preserve">；另一项晚期胚胎研究发现，低氧孵化的藏鸡血红蛋白具有更强的协同性和释氧能力</w:t>
+      </w:r>
+      <w:r>
+        <w:rPr>
+          <w:vertAlign w:val="superscript"/>
+        </w:rPr>
+        <w:t xml:space="preserve">[74]</w:t>
+      </w:r>
+      <w:r>
+        <w:t xml:space="preserve">。选择扫描和胚胎转录组研究所涉及的功能主要包括氧运输与缺氧应答（</w:t>
       </w:r>
       <w:r>
         <w:rPr>
           <w:i/>
         </w:rPr>
-        <w:t xml:space="preserve">ERBB4</w:t>
+        <w:t xml:space="preserve">HBAD</w:t>
       </w:r>
       <w:r>
         <w:t xml:space="preserve">、</w:t>
@@ -4502,7 +4412,25 @@
         <w:rPr>
           <w:i/>
         </w:rPr>
-        <w:t xml:space="preserve">PLCB2</w:t>
+        <w:t xml:space="preserve">ARNT</w:t>
+      </w:r>
+      <w:r>
+        <w:t xml:space="preserve">）</w:t>
+      </w:r>
+      <w:r>
+        <w:rPr>
+          <w:vertAlign w:val="superscript"/>
+        </w:rPr>
+        <w:t xml:space="preserve">[75,76]</w:t>
+      </w:r>
+      <w:r>
+        <w:t xml:space="preserve">、心肺发育与血管生成（</w:t>
+      </w:r>
+      <w:r>
+        <w:rPr>
+          <w:i/>
+        </w:rPr>
+        <w:t xml:space="preserve">FGFR1</w:t>
       </w:r>
       <w:r>
         <w:t xml:space="preserve">、</w:t>
@@ -4511,70 +4439,43 @@
         <w:rPr>
           <w:i/>
         </w:rPr>
-        <w:t xml:space="preserve">STIM2</w:t>
-      </w:r>
-      <w:r>
-        <w:t xml:space="preserve">）及缺氧诱导因子（HIF）相关基因的选择信号</w:t>
+        <w:t xml:space="preserve">CTGF</w:t>
+      </w:r>
+      <w:r>
+        <w:t xml:space="preserve">），以及DNA修复和辐射应答（</w:t>
+      </w:r>
+      <w:r>
+        <w:rPr>
+          <w:i/>
+        </w:rPr>
+        <w:t xml:space="preserve">VCP</w:t>
+      </w:r>
+      <w:r>
+        <w:t xml:space="preserve">、</w:t>
+      </w:r>
+      <w:r>
+        <w:rPr>
+          <w:i/>
+        </w:rPr>
+        <w:t xml:space="preserve">FANCG</w:t>
+      </w:r>
+      <w:r>
+        <w:t xml:space="preserve">）</w:t>
       </w:r>
       <w:r>
         <w:rPr>
           <w:vertAlign w:val="superscript"/>
         </w:rPr>
-        <w:t xml:space="preserve">[79]</w:t>
-      </w:r>
-      <w:r>
-        <w:t xml:space="preserve">。藏鸡内部的适应候选区域还随祖源而异。对1054个鸡全基因组的分析识别出与中国西北、川滇邻近地区和喜马拉雅山南麓相关的三个祖源；按祖源分层的选择扫描显示，三者的候选区域分别涉及血管稳态与凝血（</w:t>
-      </w:r>
-      <w:r>
-        <w:rPr>
-          <w:i/>
-        </w:rPr>
-        <w:t xml:space="preserve">VWF</w:t>
-      </w:r>
-      <w:r>
-        <w:t xml:space="preserve">、</w:t>
-      </w:r>
-      <w:r>
-        <w:rPr>
-          <w:i/>
-        </w:rPr>
-        <w:t xml:space="preserve">TSPAN9</w:t>
-      </w:r>
-      <w:r>
-        <w:t xml:space="preserve">）、钙信号与代谢调节（</w:t>
-      </w:r>
-      <w:r>
-        <w:rPr>
-          <w:i/>
-        </w:rPr>
-        <w:t xml:space="preserve">CACNA2D1</w:t>
-      </w:r>
-      <w:r>
-        <w:t xml:space="preserve">、</w:t>
-      </w:r>
-      <w:r>
-        <w:rPr>
-          <w:i/>
-        </w:rPr>
-        <w:t xml:space="preserve">AMY2A</w:t>
-      </w:r>
-      <w:r>
-        <w:t xml:space="preserve">），以及肺血管重塑（</w:t>
-      </w:r>
-      <w:r>
-        <w:rPr>
-          <w:i/>
-        </w:rPr>
-        <w:t xml:space="preserve">AGTR1</w:t>
-      </w:r>
-      <w:r>
-        <w:t xml:space="preserve">）</w:t>
+        <w:t xml:space="preserve">[77]</w:t>
+      </w:r>
+      <w:r>
+        <w:t xml:space="preserve">；肝脏的表达差异还集中在脂肪酸代谢、能量生成和谷胱甘肽抗氧化过程</w:t>
       </w:r>
       <w:r>
         <w:rPr>
           <w:vertAlign w:val="superscript"/>
         </w:rPr>
-        <w:t xml:space="preserve">[80]</w:t>
+        <w:t xml:space="preserve">[76]</w:t>
       </w:r>
       <w:r>
         <w:t xml:space="preserve">。</w:t>
@@ -4585,103 +4486,106 @@
         <w:jc w:val="both"/>
       </w:pPr>
       <w:r>
-        <w:rPr>
-          <w:b/>
-        </w:rPr>
-        <w:t xml:space="preserve">温度适应。</w:t>
-      </w:r>
-      <w:r>
-        <w:t xml:space="preserve">高温抑制肉鸡生长和胸肉产量，其影响随日龄和遗传背景而改变</w:t>
+        <w:t xml:space="preserve">青藏高原和埃塞俄比亚高原地方鸡的选择信号均涉及钙信号通路。早期藏鸡基因组研究在两个遗传群体中发现了这一信号</w:t>
       </w:r>
       <w:r>
         <w:rPr>
           <w:vertAlign w:val="superscript"/>
         </w:rPr>
-        <w:t xml:space="preserve">[81]</w:t>
-      </w:r>
-      <w:r>
-        <w:t xml:space="preserve">。耐热性也能响应人工选择：在40.6℃、75%相对湿度下按存活时间进行4代双向选择后，5周龄白来航高、低耐热系的存活时间分别为86 min和58 min</w:t>
+        <w:t xml:space="preserve">[78]</w:t>
+      </w:r>
+      <w:r>
+        <w:t xml:space="preserve">；埃塞俄比亚26个地方鸡群体、513只鸡的比较也在高海拔群体中检出钙信号通路（</w:t>
+      </w:r>
+      <w:r>
+        <w:rPr>
+          <w:i/>
+        </w:rPr>
+        <w:t xml:space="preserve">ERBB4</w:t>
+      </w:r>
+      <w:r>
+        <w:t xml:space="preserve">、</w:t>
+      </w:r>
+      <w:r>
+        <w:rPr>
+          <w:i/>
+        </w:rPr>
+        <w:t xml:space="preserve">PLCB2</w:t>
+      </w:r>
+      <w:r>
+        <w:t xml:space="preserve">、</w:t>
+      </w:r>
+      <w:r>
+        <w:rPr>
+          <w:i/>
+        </w:rPr>
+        <w:t xml:space="preserve">STIM2</w:t>
+      </w:r>
+      <w:r>
+        <w:t xml:space="preserve">）及缺氧诱导因子（HIF）相关基因的选择信号</w:t>
       </w:r>
       <w:r>
         <w:rPr>
           <w:vertAlign w:val="superscript"/>
         </w:rPr>
-        <w:t xml:space="preserve">[82]</w:t>
-      </w:r>
-      <w:r>
-        <w:t xml:space="preserve">。减少羽毛覆盖有利于散热。在35℃试验中，无羽鸡维持了接近25℃时的生长，而裸颈鸡的生长优势较小</w:t>
+        <w:t xml:space="preserve">[79]</w:t>
+      </w:r>
+      <w:r>
+        <w:t xml:space="preserve">。藏鸡内部的适应候选区域还随祖源而异。对1054个鸡全基因组的分析识别出与中国西北、川滇邻近地区和喜马拉雅山南麓相关的三个祖源；按祖源分层的选择扫描显示，三者的候选区域分别涉及血管稳态与凝血（</w:t>
+      </w:r>
+      <w:r>
+        <w:rPr>
+          <w:i/>
+        </w:rPr>
+        <w:t xml:space="preserve">VWF</w:t>
+      </w:r>
+      <w:r>
+        <w:t xml:space="preserve">、</w:t>
+      </w:r>
+      <w:r>
+        <w:rPr>
+          <w:i/>
+        </w:rPr>
+        <w:t xml:space="preserve">TSPAN9</w:t>
+      </w:r>
+      <w:r>
+        <w:t xml:space="preserve">）、钙信号与代谢调节（</w:t>
+      </w:r>
+      <w:r>
+        <w:rPr>
+          <w:i/>
+        </w:rPr>
+        <w:t xml:space="preserve">CACNA2D1</w:t>
+      </w:r>
+      <w:r>
+        <w:t xml:space="preserve">、</w:t>
+      </w:r>
+      <w:r>
+        <w:rPr>
+          <w:i/>
+        </w:rPr>
+        <w:t xml:space="preserve">AMY2A</w:t>
+      </w:r>
+      <w:r>
+        <w:t xml:space="preserve">），以及肺血管重塑（</w:t>
+      </w:r>
+      <w:r>
+        <w:rPr>
+          <w:i/>
+        </w:rPr>
+        <w:t xml:space="preserve">AGTR1</w:t>
+      </w:r>
+      <w:r>
+        <w:t xml:space="preserve">）</w:t>
       </w:r>
       <w:r>
         <w:rPr>
           <w:vertAlign w:val="superscript"/>
         </w:rPr>
-        <w:t xml:space="preserve">[83]</w:t>
-      </w:r>
-      <w:r>
-        <w:t xml:space="preserve">。热带与温带鸡的基因组比较进一步检出代谢调节（</w:t>
-      </w:r>
-      <w:r>
-        <w:rPr>
-          <w:i/>
-        </w:rPr>
-        <w:t xml:space="preserve">FABP2</w:t>
-      </w:r>
-      <w:r>
-        <w:t xml:space="preserve">、</w:t>
-      </w:r>
-      <w:r>
-        <w:rPr>
-          <w:i/>
-        </w:rPr>
-        <w:t xml:space="preserve">RAMP3</w:t>
-      </w:r>
-      <w:r>
-        <w:t xml:space="preserve">、</w:t>
-      </w:r>
-      <w:r>
-        <w:rPr>
-          <w:i/>
-        </w:rPr>
-        <w:t xml:space="preserve">TSHR</w:t>
-      </w:r>
-      <w:r>
-        <w:t xml:space="preserve">）和血管平滑肌收缩（</w:t>
-      </w:r>
-      <w:r>
-        <w:rPr>
-          <w:i/>
-        </w:rPr>
-        <w:t xml:space="preserve">CAMK2D</w:t>
-      </w:r>
-      <w:r>
-        <w:t xml:space="preserve">）相关候选基因</w:t>
-      </w:r>
-      <w:r>
-        <w:rPr>
-          <w:vertAlign w:val="superscript"/>
-        </w:rPr>
-        <w:t xml:space="preserve">[84]</w:t>
-      </w:r>
-      <w:r>
-        <w:t xml:space="preserve">。在淮南鸡分离群体中，携带</w:t>
-      </w:r>
-      <w:r>
-        <w:rPr>
-          <w:i/>
-        </w:rPr>
-        <w:t xml:space="preserve">TSHR</w:t>
-      </w:r>
-      <w:r>
-        <w:t xml:space="preserve"> Gly558Arg变异的纯合子经35±1℃、12 h热应激试验后，血清丙氨酸氨基转移酶、乳酸脱氢酶和肌酸激酶水平低于野生型</w:t>
-      </w:r>
-      <w:r>
-        <w:rPr>
-          <w:vertAlign w:val="superscript"/>
-        </w:rPr>
-        <w:t xml:space="preserve">[84]</w:t>
-      </w:r>
-      <w:r>
-        <w:t xml:space="preserve">。该基因与光周期及繁殖反应的关系见第6.2节。</w:t>
+        <w:t xml:space="preserve">[80]</w:t>
+      </w:r>
+      <w:r>
+        <w:t xml:space="preserve">。</w:t>
       </w:r>
     </w:p>
     <w:p>
@@ -4689,70 +4593,103 @@
         <w:jc w:val="both"/>
       </w:pPr>
       <w:r>
-        <w:t xml:space="preserve">在低温条件下，品种间的产蛋表现出现逆转。在温暖与自然寒冷环境中比较坝上长尾鸡、洛岛红鸡及其正反交后代发现，洛岛红鸡在温暖环境下产蛋表现最好，在寒冷环境下却低于其余三组；两类杂交后代在寒冷环境下的产蛋表现又高于坝上长尾鸡</w:t>
+        <w:rPr>
+          <w:b/>
+        </w:rPr>
+        <w:t xml:space="preserve">温度适应。</w:t>
+      </w:r>
+      <w:r>
+        <w:t xml:space="preserve">高温抑制肉鸡生长和胸肉产量，其影响随日龄和遗传背景而改变</w:t>
       </w:r>
       <w:r>
         <w:rPr>
           <w:vertAlign w:val="superscript"/>
         </w:rPr>
-        <w:t xml:space="preserve">[85]</w:t>
-      </w:r>
-      <w:r>
-        <w:t xml:space="preserve">。同一试验体系的甲状腺研究显示，坝上长尾鸡在两种环境下的血清甲状腺激素水平均高于洛岛红鸡；比较寒冷与温暖环境时，两品种分别检出402个和46个甲状腺差异表达基因</w:t>
+        <w:t xml:space="preserve">[81]</w:t>
+      </w:r>
+      <w:r>
+        <w:t xml:space="preserve">。耐热性也能响应人工选择：在40.6℃、75%相对湿度下按存活时间进行4代双向选择后，5周龄白来航高、低耐热系的存活时间分别为86 min和58 min</w:t>
       </w:r>
       <w:r>
         <w:rPr>
           <w:vertAlign w:val="superscript"/>
         </w:rPr>
-        <w:t xml:space="preserve">[86]</w:t>
-      </w:r>
-      <w:r>
-        <w:t xml:space="preserve">。不同耐寒品种的候选基因涉及不同生理环节：加拿大Chantecler鸡中检出的</w:t>
+        <w:t xml:space="preserve">[82]</w:t>
+      </w:r>
+      <w:r>
+        <w:t xml:space="preserve">。减少羽毛覆盖有利于散热。在35℃试验中，无羽鸡维持了接近25℃时的生长，而裸颈鸡的生长优势较小</w:t>
+      </w:r>
+      <w:r>
+        <w:rPr>
+          <w:vertAlign w:val="superscript"/>
+        </w:rPr>
+        <w:t xml:space="preserve">[83]</w:t>
+      </w:r>
+      <w:r>
+        <w:t xml:space="preserve">。热带与温带鸡的基因组比较进一步检出代谢调节（</w:t>
       </w:r>
       <w:r>
         <w:rPr>
           <w:i/>
         </w:rPr>
-        <w:t xml:space="preserve">ME3</w:t>
-      </w:r>
-      <w:r>
-        <w:t xml:space="preserve">和</w:t>
+        <w:t xml:space="preserve">FABP2</w:t>
+      </w:r>
+      <w:r>
+        <w:t xml:space="preserve">、</w:t>
       </w:r>
       <w:r>
         <w:rPr>
           <w:i/>
         </w:rPr>
-        <w:t xml:space="preserve">ZNF536</w:t>
-      </w:r>
-      <w:r>
-        <w:t xml:space="preserve">分别与脂质代谢、神经调节有关</w:t>
+        <w:t xml:space="preserve">RAMP3</w:t>
+      </w:r>
+      <w:r>
+        <w:t xml:space="preserve">、</w:t>
+      </w:r>
+      <w:r>
+        <w:rPr>
+          <w:i/>
+        </w:rPr>
+        <w:t xml:space="preserve">TSHR</w:t>
+      </w:r>
+      <w:r>
+        <w:t xml:space="preserve">）和血管平滑肌收缩（</w:t>
+      </w:r>
+      <w:r>
+        <w:rPr>
+          <w:i/>
+        </w:rPr>
+        <w:t xml:space="preserve">CAMK2D</w:t>
+      </w:r>
+      <w:r>
+        <w:t xml:space="preserve">）相关候选基因</w:t>
       </w:r>
       <w:r>
         <w:rPr>
           <w:vertAlign w:val="superscript"/>
         </w:rPr>
-        <w:t xml:space="preserve">[87]</w:t>
-      </w:r>
-      <w:r>
-        <w:t xml:space="preserve">；林甸鸡中具有较强选择信号的</w:t>
+        <w:t xml:space="preserve">[84]</w:t>
+      </w:r>
+      <w:r>
+        <w:t xml:space="preserve">。在淮南鸡分离群体中，</w:t>
       </w:r>
       <w:r>
         <w:rPr>
           <w:i/>
         </w:rPr>
-        <w:t xml:space="preserve">NDUFS4</w:t>
-      </w:r>
-      <w:r>
-        <w:t xml:space="preserve">参与线粒体氧化磷酸化，其多个位点在不同温度地区的鸡群间呈频率分化；波兰和芬兰鸡群也显示出与寒冷地区中国鸡群相近的分化模式</w:t>
+        <w:t xml:space="preserve">TSHR</w:t>
+      </w:r>
+      <w:r>
+        <w:t xml:space="preserve"> 558Arg等位基因纯合子经35±1℃、12 h热应激试验后，血清丙氨酸氨基转移酶、乳酸脱氢酶和肌酸激酶水平低于野生型</w:t>
       </w:r>
       <w:r>
         <w:rPr>
           <w:vertAlign w:val="superscript"/>
         </w:rPr>
-        <w:t xml:space="preserve">[88]</w:t>
-      </w:r>
-      <w:r>
-        <w:t xml:space="preserve">。</w:t>
+        <w:t xml:space="preserve">[84]</w:t>
+      </w:r>
+      <w:r>
+        <w:t xml:space="preserve">。该基因与光周期及繁殖反应的关系见第6.2节。</w:t>
       </w:r>
     </w:p>
     <w:p>
@@ -4760,100 +4697,67 @@
         <w:jc w:val="both"/>
       </w:pPr>
       <w:r>
-        <w:rPr>
-          <w:b/>
-        </w:rPr>
-        <w:t xml:space="preserve">抗病性。</w:t>
-      </w:r>
-      <w:r>
-        <w:t xml:space="preserve">鸡的抗病性差异表现为感染后的生长受损、组织病变和病原负荷不同。在抗性法尤米鸡与易感白来航鸡的F₂群体中，研究定位到与柔嫩艾美耳球虫感染后增重、血细胞比容和肠道病变等性状相关的数量性状基因座（QTL），其中增重相关基因座分布于多个染色体</w:t>
+        <w:t xml:space="preserve">在低温条件下，品种间的产蛋表现出现逆转。在温暖与自然寒冷环境中比较坝上长尾鸡、洛岛红鸡及其正反交后代发现，洛岛红鸡在温暖环境下产蛋表现最好，在寒冷环境下却低于其余三组；两类杂交后代在寒冷环境下的产蛋表现又高于坝上长尾鸡</w:t>
       </w:r>
       <w:r>
         <w:rPr>
           <w:vertAlign w:val="superscript"/>
         </w:rPr>
-        <w:t xml:space="preserve">[89]</w:t>
-      </w:r>
-      <w:r>
-        <w:t xml:space="preserve">。空肠弯曲杆菌肠道定植抗性的14号染色体QTL在回交群体和F₉高级互交群体中得到定位与细化，14号和16号染色体上的两个抗性区域与既有沙门氏菌抗性QTL重叠</w:t>
+        <w:t xml:space="preserve">[85]</w:t>
+      </w:r>
+      <w:r>
+        <w:t xml:space="preserve">。同一试验体系的甲状腺研究显示，坝上长尾鸡在两种环境下的血清甲状腺激素水平均高于洛岛红鸡；比较寒冷与温暖环境时，两品种分别检出402个和46个甲状腺差异表达基因</w:t>
       </w:r>
       <w:r>
         <w:rPr>
           <w:vertAlign w:val="superscript"/>
         </w:rPr>
-        <w:t xml:space="preserve">[90]</w:t>
-      </w:r>
-      <w:r>
-        <w:t xml:space="preserve">。对沙门氏菌相关细胞表型的研究，将抗性基因座与异嗜性粒细胞功能联系起来。在肉鸡×白来航和肉鸡×法尤米两组F₁₃高级互交群体中，</w:t>
+        <w:t xml:space="preserve">[86]</w:t>
+      </w:r>
+      <w:r>
+        <w:t xml:space="preserve">。不同耐寒品种的候选基因涉及不同生理环节：加拿大Chantecler鸡中检出的</w:t>
       </w:r>
       <w:r>
         <w:rPr>
           <w:i/>
         </w:rPr>
-        <w:t xml:space="preserve">SLC11A1</w:t>
-      </w:r>
-      <w:r>
-        <w:t xml:space="preserve">区域分别与吞噬和胞外诱捕网形成相关；在后一群体中，</w:t>
+        <w:t xml:space="preserve">ME3</w:t>
+      </w:r>
+      <w:r>
+        <w:t xml:space="preserve">和</w:t>
       </w:r>
       <w:r>
         <w:rPr>
           <w:i/>
         </w:rPr>
-        <w:t xml:space="preserve">SAL1</w:t>
-      </w:r>
-      <w:r>
-        <w:t xml:space="preserve">基因座也与胞外诱捕网形成相关，其候选基因</w:t>
+        <w:t xml:space="preserve">ZNF536</w:t>
+      </w:r>
+      <w:r>
+        <w:t xml:space="preserve">分别与脂质代谢、神经调节有关</w:t>
+      </w:r>
+      <w:r>
+        <w:rPr>
+          <w:vertAlign w:val="superscript"/>
+        </w:rPr>
+        <w:t xml:space="preserve">[87]</w:t>
+      </w:r>
+      <w:r>
+        <w:t xml:space="preserve">；林甸鸡中具有较强选择信号的</w:t>
       </w:r>
       <w:r>
         <w:rPr>
           <w:i/>
         </w:rPr>
-        <w:t xml:space="preserve">SIVA1</w:t>
-      </w:r>
-      <w:r>
-        <w:t xml:space="preserve">涉及细胞死亡调节</w:t>
+        <w:t xml:space="preserve">NDUFS4</w:t>
+      </w:r>
+      <w:r>
+        <w:t xml:space="preserve">参与线粒体氧化磷酸化，其多个位点在不同温度地区的鸡群间呈频率分化；波兰和芬兰鸡群也显示出与寒冷地区中国鸡群相近的分化模式</w:t>
       </w:r>
       <w:r>
         <w:rPr>
           <w:vertAlign w:val="superscript"/>
         </w:rPr>
-        <w:t xml:space="preserve">[91]</w:t>
-      </w:r>
-      <w:r>
-        <w:t xml:space="preserve">。马立克病抗性品系与易感品系的基因组比较则检出含有</w:t>
-      </w:r>
-      <w:r>
-        <w:rPr>
-          <w:i/>
-        </w:rPr>
-        <w:t xml:space="preserve">AKT1</w:t>
-      </w:r>
-      <w:r>
-        <w:t xml:space="preserve">、</w:t>
-      </w:r>
-      <w:r>
-        <w:rPr>
-          <w:i/>
-        </w:rPr>
-        <w:t xml:space="preserve">API5</w:t>
-      </w:r>
-      <w:r>
-        <w:t xml:space="preserve">、</w:t>
-      </w:r>
-      <w:r>
-        <w:rPr>
-          <w:i/>
-        </w:rPr>
-        <w:t xml:space="preserve">TNFSF13B</w:t>
-      </w:r>
-      <w:r>
-        <w:t xml:space="preserve">等基因的候选区域，涉及细胞存活、凋亡及B细胞调节</w:t>
-      </w:r>
-      <w:r>
-        <w:rPr>
-          <w:vertAlign w:val="superscript"/>
-        </w:rPr>
-        <w:t xml:space="preserve">[92]</w:t>
+        <w:t xml:space="preserve">[88]</w:t>
       </w:r>
       <w:r>
         <w:t xml:space="preserve">。</w:t>
@@ -4864,13 +4768,82 @@
         <w:jc w:val="both"/>
       </w:pPr>
       <w:r>
-        <w:t xml:space="preserve">地方鸡的大群体感染试验还揭示了抗病反应的群体差异。加纳1440只鸡和坦桑尼亚1399只鸡的弱毒新城疫病毒感染试验表明，感染后病毒载量和抗体水平的差异具有遗传基础；两地定位的QTL没有重叠，但候选基因均涉及免疫调节，加纳群体包括</w:t>
+        <w:rPr>
+          <w:b/>
+        </w:rPr>
+        <w:t xml:space="preserve">抗病性。</w:t>
+      </w:r>
+      <w:r>
+        <w:t xml:space="preserve">鸡的抗病性差异表现为感染后的生长受损、组织病变和病原负荷不同。在抗性法尤米鸡与易感白来航鸡的F₂群体中，研究定位到与柔嫩艾美耳球虫感染后增重、血细胞比容和肠道病变等性状相关的数量性状基因座（QTL），其中增重相关基因座分布于多个染色体</w:t>
+      </w:r>
+      <w:r>
+        <w:rPr>
+          <w:vertAlign w:val="superscript"/>
+        </w:rPr>
+        <w:t xml:space="preserve">[89]</w:t>
+      </w:r>
+      <w:r>
+        <w:t xml:space="preserve">。空肠弯曲杆菌肠道定植抗性的14号染色体QTL在回交群体和F₉高级互交群体中得到定位与细化，14号和16号染色体上的两个抗性区域与既有沙门氏菌抗性QTL重叠</w:t>
+      </w:r>
+      <w:r>
+        <w:rPr>
+          <w:vertAlign w:val="superscript"/>
+        </w:rPr>
+        <w:t xml:space="preserve">[90]</w:t>
+      </w:r>
+      <w:r>
+        <w:t xml:space="preserve">。对沙门氏菌相关细胞表型的研究，将抗性基因座与异嗜性粒细胞功能联系起来。在肉鸡×白来航和肉鸡×法尤米两组F₁₃高级互交群体中，</w:t>
       </w:r>
       <w:r>
         <w:rPr>
           <w:i/>
         </w:rPr>
-        <w:t xml:space="preserve">VAV2</w:t>
+        <w:t xml:space="preserve">SLC11A1</w:t>
+      </w:r>
+      <w:r>
+        <w:t xml:space="preserve">区域分别与吞噬和胞外诱捕网形成相关；在后一群体中，</w:t>
+      </w:r>
+      <w:r>
+        <w:rPr>
+          <w:i/>
+        </w:rPr>
+        <w:t xml:space="preserve">SAL1</w:t>
+      </w:r>
+      <w:r>
+        <w:t xml:space="preserve">基因座也与胞外诱捕网形成相关，其候选基因</w:t>
+      </w:r>
+      <w:r>
+        <w:rPr>
+          <w:i/>
+        </w:rPr>
+        <w:t xml:space="preserve">SIVA1</w:t>
+      </w:r>
+      <w:r>
+        <w:t xml:space="preserve">涉及细胞死亡调节</w:t>
+      </w:r>
+      <w:r>
+        <w:rPr>
+          <w:vertAlign w:val="superscript"/>
+        </w:rPr>
+        <w:t xml:space="preserve">[91]</w:t>
+      </w:r>
+      <w:r>
+        <w:t xml:space="preserve">。在马立克病抗性的白来航近交系63、易感系72及其衍生品系中，抗性组的纯合片段含</w:t>
+      </w:r>
+      <w:r>
+        <w:rPr>
+          <w:i/>
+        </w:rPr>
+        <w:t xml:space="preserve">TNFSF13B</w:t>
+      </w:r>
+      <w:r>
+        <w:t xml:space="preserve">等免疫相关基因，群体分化分析则检出与细胞死亡和抗凋亡相关的</w:t>
+      </w:r>
+      <w:r>
+        <w:rPr>
+          <w:i/>
+        </w:rPr>
+        <w:t xml:space="preserve">AKT1</w:t>
       </w:r>
       <w:r>
         <w:t xml:space="preserve">、</w:t>
@@ -4879,58 +4852,16 @@
         <w:rPr>
           <w:i/>
         </w:rPr>
-        <w:t xml:space="preserve">IL12B</w:t>
-      </w:r>
-      <w:r>
-        <w:t xml:space="preserve">，坦桑尼亚群体包括</w:t>
-      </w:r>
-      <w:r>
-        <w:rPr>
-          <w:i/>
-        </w:rPr>
-        <w:t xml:space="preserve">TIRAP</w:t>
-      </w:r>
-      <w:r>
-        <w:t xml:space="preserve">、</w:t>
-      </w:r>
-      <w:r>
-        <w:rPr>
-          <w:i/>
-        </w:rPr>
-        <w:t xml:space="preserve">ETS1</w:t>
+        <w:t xml:space="preserve">API5</w:t>
+      </w:r>
+      <w:r>
+        <w:t xml:space="preserve">等基因</w:t>
       </w:r>
       <w:r>
         <w:rPr>
           <w:vertAlign w:val="superscript"/>
         </w:rPr>
-        <w:t xml:space="preserve">[93,94]</w:t>
-      </w:r>
-      <w:r>
-        <w:t xml:space="preserve">。其中，坦桑尼亚鸡感染后第6天病毒载量相关的24号染色体区域，也在热应激条件下的海兰褐蛋鸡中检出</w:t>
-      </w:r>
-      <w:r>
-        <w:rPr>
-          <w:vertAlign w:val="superscript"/>
-        </w:rPr>
-        <w:t xml:space="preserve">[95]</w:t>
-      </w:r>
-      <w:r>
-        <w:t xml:space="preserve">。品系差异还影响病毒传播：在低致病性H7N7禽流感病毒感染试验中，0系鸡经鼻感染后缺少持续的泄殖腔排毒，也未将病毒传给接触鸡，而C-B12系鸡持续排毒并发生传播</w:t>
-      </w:r>
-      <w:r>
-        <w:rPr>
-          <w:vertAlign w:val="superscript"/>
-        </w:rPr>
-        <w:t xml:space="preserve">[96]</w:t>
-      </w:r>
-      <w:r>
-        <w:t xml:space="preserve">。同一品种的抗性优势又随病原而变。越南Ri鸡对鸡蛔虫和肠炎沙门氏菌的抗性高于商业Luong Phuong鸡，却对多杀性巴氏杆菌更易感；这一比较还发现，主要组织相容性复合体（MHC）单倍型分别与鸡蛔虫感染强度和抗沙门氏菌抗体反应相关</w:t>
-      </w:r>
-      <w:r>
-        <w:rPr>
-          <w:vertAlign w:val="superscript"/>
-        </w:rPr>
-        <w:t xml:space="preserve">[97]</w:t>
+        <w:t xml:space="preserve">[92]</w:t>
       </w:r>
       <w:r>
         <w:t xml:space="preserve">。</w:t>
@@ -4938,10 +4869,79 @@
     </w:p>
     <w:p>
       <w:pPr>
-        <w:pStyle w:val="Heading2"/>
-      </w:pPr>
-      <w:r>
-        <w:t xml:space="preserve">6.2 人工选择与用途性状分化</w:t>
+        <w:jc w:val="both"/>
+      </w:pPr>
+      <w:r>
+        <w:t xml:space="preserve">地方鸡的大群体感染试验还揭示了抗病反应的群体差异。加纳1440只鸡和坦桑尼亚1399只鸡的弱毒新城疫病毒感染试验表明，感染后病毒载量和抗体水平的差异具有遗传基础；两地定位的QTL没有重叠，但候选基因均涉及免疫调节，加纳群体包括</w:t>
+      </w:r>
+      <w:r>
+        <w:rPr>
+          <w:i/>
+        </w:rPr>
+        <w:t xml:space="preserve">VAV2</w:t>
+      </w:r>
+      <w:r>
+        <w:t xml:space="preserve">、</w:t>
+      </w:r>
+      <w:r>
+        <w:rPr>
+          <w:i/>
+        </w:rPr>
+        <w:t xml:space="preserve">IL12B</w:t>
+      </w:r>
+      <w:r>
+        <w:t xml:space="preserve">，坦桑尼亚群体包括</w:t>
+      </w:r>
+      <w:r>
+        <w:rPr>
+          <w:i/>
+        </w:rPr>
+        <w:t xml:space="preserve">TIRAP</w:t>
+      </w:r>
+      <w:r>
+        <w:t xml:space="preserve">、</w:t>
+      </w:r>
+      <w:r>
+        <w:rPr>
+          <w:i/>
+        </w:rPr>
+        <w:t xml:space="preserve">ETS1</w:t>
+      </w:r>
+      <w:r>
+        <w:rPr>
+          <w:vertAlign w:val="superscript"/>
+        </w:rPr>
+        <w:t xml:space="preserve">[93,94]</w:t>
+      </w:r>
+      <w:r>
+        <w:t xml:space="preserve">。其中，坦桑尼亚鸡感染后第6天病毒载量相关的24号染色体区域，也在热应激条件下的海兰褐蛋鸡中检出</w:t>
+      </w:r>
+      <w:r>
+        <w:rPr>
+          <w:vertAlign w:val="superscript"/>
+        </w:rPr>
+        <w:t xml:space="preserve">[95]</w:t>
+      </w:r>
+      <w:r>
+        <w:t xml:space="preserve">。品系差异还影响病毒传播：在低致病性H7N7禽流感病毒感染试验中，0系鸡经鼻感染后缺少持续的泄殖腔排毒，也未将病毒传给接触鸡，而C-B12系鸡持续排毒并发生传播</w:t>
+      </w:r>
+      <w:r>
+        <w:rPr>
+          <w:vertAlign w:val="superscript"/>
+        </w:rPr>
+        <w:t xml:space="preserve">[96]</w:t>
+      </w:r>
+      <w:r>
+        <w:t xml:space="preserve">。同一品种的抗性优势又随病原而变。越南Ri鸡对鸡蛔虫和肠炎沙门氏菌的抗性高于商业Luong Phuong鸡，却对多杀性巴氏杆菌更易感；这一比较还发现，主要组织相容性复合体（MHC）单倍型分别与鸡蛔虫感染强度和抗沙门氏菌抗体反应相关</w:t>
+      </w:r>
+      <w:r>
+        <w:rPr>
+          <w:vertAlign w:val="superscript"/>
+        </w:rPr>
+        <w:t xml:space="preserve">[97]</w:t>
+      </w:r>
+      <w:r>
+        <w:t xml:space="preserve">。</w:t>
       </w:r>
     </w:p>
     <w:p>
@@ -4949,279 +4949,15 @@
         <w:jc w:val="both"/>
       </w:pPr>
       <w:r>
-        <w:rPr>
-          <w:b/>
-        </w:rPr>
-        <w:t xml:space="preserve">生长。</w:t>
-      </w:r>
-      <w:r>
-        <w:t xml:space="preserve">肉用选择加快了家鸡生长，并改变了肌肉与脂肪的分配。1957年、1978年保存品系与2005年商业肉鸡在相同营养条件下的比较显示，近半个世纪的选育使料重比降低约50%，胸肌产量增加</w:t>
-      </w:r>
-      <w:r>
-        <w:rPr>
-          <w:vertAlign w:val="superscript"/>
-        </w:rPr>
-        <w:t xml:space="preserve">[98]</w:t>
-      </w:r>
-      <w:r>
-        <w:t xml:space="preserve">。这些变化涉及采食与饱腹调控、组织生长和脂肪沉积：高生长单倍型对应较低的</w:t>
-      </w:r>
-      <w:r>
-        <w:rPr>
-          <w:i/>
-        </w:rPr>
-        <w:t xml:space="preserve">CCKAR</w:t>
-      </w:r>
-      <w:r>
-        <w:t xml:space="preserve">表达和减弱的饱腹反馈</w:t>
-      </w:r>
-      <w:r>
-        <w:rPr>
-          <w:vertAlign w:val="superscript"/>
-        </w:rPr>
-        <w:t xml:space="preserve">[99]</w:t>
-      </w:r>
-      <w:r>
-        <w:t xml:space="preserve">，</w:t>
-      </w:r>
-      <w:r>
-        <w:rPr>
-          <w:i/>
-        </w:rPr>
-        <w:t xml:space="preserve">IGF2BP1</w:t>
-      </w:r>
-      <w:r>
-        <w:t xml:space="preserve">上游缺失提高调控活性，并与较大体型相关</w:t>
-      </w:r>
-      <w:r>
-        <w:rPr>
-          <w:vertAlign w:val="superscript"/>
-        </w:rPr>
-        <w:t xml:space="preserve">[100]</w:t>
-      </w:r>
-      <w:r>
-        <w:t xml:space="preserve">。Connecticut伴性矮小鸡的</w:t>
-      </w:r>
-      <w:r>
-        <w:rPr>
-          <w:i/>
-        </w:rPr>
-        <w:t xml:space="preserve">GHR</w:t>
-      </w:r>
-      <w:r>
-        <w:t xml:space="preserve">基因3′端1773 bp缺失则与受体缺陷和矮小表型相关</w:t>
-      </w:r>
-      <w:r>
-        <w:rPr>
-          <w:vertAlign w:val="superscript"/>
-        </w:rPr>
-        <w:t xml:space="preserve">[101]</w:t>
-      </w:r>
-      <w:r>
-        <w:t xml:space="preserve">。在腹脂双向选择鸡系中，13 bp插入缺失位点rs734209466的插入等位型通过转录因子IRF4增强远端</w:t>
-      </w:r>
-      <w:r>
-        <w:rPr>
-          <w:i/>
-        </w:rPr>
-        <w:t xml:space="preserve">IGFBP2</w:t>
-      </w:r>
-      <w:r>
-        <w:t xml:space="preserve">和</w:t>
-      </w:r>
-      <w:r>
-        <w:rPr>
-          <w:i/>
-        </w:rPr>
-        <w:t xml:space="preserve">IGFBP5</w:t>
-      </w:r>
-      <w:r>
-        <w:t xml:space="preserve">的表达，影响前脂肪细胞增殖与分化</w:t>
-      </w:r>
-      <w:r>
-        <w:rPr>
-          <w:vertAlign w:val="superscript"/>
-        </w:rPr>
-        <w:t xml:space="preserve">[102]</w:t>
-      </w:r>
-      <w:r>
-        <w:t xml:space="preserve">。弗吉尼亚长期选择系的研究显示，多个原有遗传变异共同贡献了体重选择响应</w:t>
-      </w:r>
-      <w:r>
-        <w:rPr>
-          <w:vertAlign w:val="superscript"/>
-        </w:rPr>
-        <w:t xml:space="preserve">[103]</w:t>
-      </w:r>
-      <w:r>
-        <w:t xml:space="preserve">。该系列的互交研究还识别出Growth9与另外三个基因座组成的互作网络，其他基因座的促生长效应取决于Growth9的基因型</w:t>
-      </w:r>
-      <w:r>
-        <w:rPr>
-          <w:vertAlign w:val="superscript"/>
-        </w:rPr>
-        <w:t xml:space="preserve">[104]</w:t>
-      </w:r>
-      <w:r>
-        <w:t xml:space="preserve">。另在优质鸡系HQLA与惠阳胡须鸡建立的F₁₆高级互交群体中，多组织分析识别了与生长性状相关的组织特异调控关系</w:t>
-      </w:r>
-      <w:r>
-        <w:rPr>
-          <w:vertAlign w:val="superscript"/>
-        </w:rPr>
-        <w:t xml:space="preserve">[105]</w:t>
-      </w:r>
-      <w:r>
-        <w:t xml:space="preserve">。在斯洛文尼亚Prelux-bro品系34代双向选择中，模型估计高体重系约在6～8代达到总选择响应的一半，低体重系则需20～28代</w:t>
-      </w:r>
-      <w:r>
-        <w:rPr>
-          <w:vertAlign w:val="superscript"/>
-        </w:rPr>
-        <w:t xml:space="preserve">[106]</w:t>
-      </w:r>
-      <w:r>
-        <w:t xml:space="preserve">；中国肉鸡经13代剩余采食量选择，低剩余采食量系在降低采食量和料重比的同时维持了生长表现</w:t>
-      </w:r>
-      <w:r>
-        <w:rPr>
-          <w:vertAlign w:val="superscript"/>
-        </w:rPr>
-        <w:t xml:space="preserve">[107]</w:t>
-      </w:r>
-      <w:r>
-        <w:t xml:space="preserve">。</w:t>
+        <w:t xml:space="preserve">总之，这些适应性差异既见于地方鸡，也见于实验品系；除少数位点有功能验证外，多数证据来自选择扫描、关联定位或表达比较，相关变异出现的时间大多尚未确定。</w:t>
       </w:r>
     </w:p>
     <w:p>
       <w:pPr>
-        <w:jc w:val="both"/>
-      </w:pPr>
-      <w:r>
-        <w:rPr>
-          <w:b/>
-        </w:rPr>
-        <w:t xml:space="preserve">繁殖。</w:t>
-      </w:r>
-      <w:r>
-        <w:t xml:space="preserve">繁殖改良涉及性成熟、产蛋持续性、孵抱行为和受精能力。相关遗传差异包括光周期反应（</w:t>
-      </w:r>
-      <w:r>
-        <w:rPr>
-          <w:i/>
-        </w:rPr>
-        <w:t xml:space="preserve">TSHR</w:t>
-      </w:r>
-      <w:r>
-        <w:t xml:space="preserve">）</w:t>
-      </w:r>
-      <w:r>
-        <w:rPr>
-          <w:vertAlign w:val="superscript"/>
-        </w:rPr>
-        <w:t xml:space="preserve">[108]</w:t>
-      </w:r>
-      <w:r>
-        <w:t xml:space="preserve">、孵抱行为相关基因座</w:t>
-      </w:r>
-      <w:r>
-        <w:rPr>
-          <w:vertAlign w:val="superscript"/>
-        </w:rPr>
-        <w:t xml:space="preserve">[109]</w:t>
-      </w:r>
-      <w:r>
-        <w:t xml:space="preserve">，以及骨代谢与繁殖性状共享的遗传区域（</w:t>
-      </w:r>
-      <w:r>
-        <w:rPr>
-          <w:i/>
-        </w:rPr>
-        <w:t xml:space="preserve">HAO1</w:t>
-      </w:r>
-      <w:r>
-        <w:t xml:space="preserve">、</w:t>
-      </w:r>
-      <w:r>
-        <w:rPr>
-          <w:i/>
-        </w:rPr>
-        <w:t xml:space="preserve">BMP2</w:t>
-      </w:r>
-      <w:r>
-        <w:t xml:space="preserve">附近）</w:t>
-      </w:r>
-      <w:r>
-        <w:rPr>
-          <w:vertAlign w:val="superscript"/>
-        </w:rPr>
-        <w:t xml:space="preserve">[110]</w:t>
-      </w:r>
-      <w:r>
-        <w:t xml:space="preserve">。在红原鸡与白来航互交群体中，携带</w:t>
-      </w:r>
-      <w:r>
-        <w:rPr>
-          <w:i/>
-        </w:rPr>
-        <w:t xml:space="preserve">TSHR</w:t>
-      </w:r>
-      <w:r>
-        <w:t xml:space="preserve"> 558Arg等位基因的纯合雄鸡对日长缩短的睾丸反应较弱；在白来航与丝羽鸡互交群体中，不孵抱亲本来源的等位基因在不同基因座分别促进或抑制孵抱</w:t>
-      </w:r>
-      <w:r>
-        <w:rPr>
-          <w:vertAlign w:val="superscript"/>
-        </w:rPr>
-        <w:t xml:space="preserve">[108,109]</w:t>
-      </w:r>
-      <w:r>
-        <w:t xml:space="preserve">。产蛋调控随阶段变化：对1004只鸡全基因组及至700日龄产蛋记录的联合分析，检出了分期产蛋的加性和显性效应</w:t>
-      </w:r>
-      <w:r>
-        <w:rPr>
-          <w:vertAlign w:val="superscript"/>
-        </w:rPr>
-        <w:t xml:space="preserve">[111]</w:t>
-      </w:r>
-      <w:r>
-        <w:t xml:space="preserve">。另一项研究对商业白洛克母鸡在20、30和58周龄采集的下丘脑、垂体、卵巢及肝脏样本进行分析，显示调控效应具有组织和阶段特异性</w:t>
-      </w:r>
-      <w:r>
-        <w:rPr>
-          <w:vertAlign w:val="superscript"/>
-        </w:rPr>
-        <w:t xml:space="preserve">[112]</w:t>
-      </w:r>
-      <w:r>
-        <w:t xml:space="preserve">。地方鸡长期选择资料中，开产日龄与产蛋量的遗传相关因品系和代次而异</w:t>
-      </w:r>
-      <w:r>
-        <w:rPr>
-          <w:vertAlign w:val="superscript"/>
-        </w:rPr>
-        <w:t xml:space="preserve">[113]</w:t>
-      </w:r>
-      <w:r>
-        <w:t xml:space="preserve">；弗吉尼亚鸡54代8周龄体重双向选择中，低体重选择系的性成熟延迟更明显</w:t>
-      </w:r>
-      <w:r>
-        <w:rPr>
-          <w:vertAlign w:val="superscript"/>
-        </w:rPr>
-        <w:t xml:space="preserve">[114]</w:t>
-      </w:r>
-      <w:r>
-        <w:t xml:space="preserve">。雄鸡的精子运动能力具有遗传基础，并影响雌体储精后的受精效率</w:t>
-      </w:r>
-      <w:r>
-        <w:rPr>
-          <w:vertAlign w:val="superscript"/>
-        </w:rPr>
-        <w:t xml:space="preserve">[115]</w:t>
-      </w:r>
-      <w:r>
-        <w:t xml:space="preserve">。</w:t>
+        <w:pStyle w:val="Heading2"/>
+      </w:pPr>
+      <w:r>
+        <w:t xml:space="preserve">6.2 人工选择与用途性状分化</w:t>
       </w:r>
     </w:p>
     <w:p>
@@ -5232,241 +4968,142 @@
         <w:rPr>
           <w:b/>
         </w:rPr>
-        <w:t xml:space="preserve">外形与观赏性状。</w:t>
-      </w:r>
-      <w:r>
-        <w:t xml:space="preserve">家鸡在羽色、羽型、皮肤色素及头部和四肢外形上形成了丰富的品种差异。这些性状涉及羽色和羽内图案（</w:t>
+        <w:t xml:space="preserve">生长。</w:t>
+      </w:r>
+      <w:r>
+        <w:t xml:space="preserve">肉用选择加快了家鸡生长，并改变了肌肉与脂肪的分配。1957年、1978年保存品系与2005年商业肉鸡在相同营养条件下的比较显示，近半个世纪的选育使料重比降低约50%，胸肌产量增加</w:t>
+      </w:r>
+      <w:r>
+        <w:rPr>
+          <w:vertAlign w:val="superscript"/>
+        </w:rPr>
+        <w:t xml:space="preserve">[98]</w:t>
+      </w:r>
+      <w:r>
+        <w:t xml:space="preserve">。这些变化涉及采食与饱腹调控、组织生长和脂肪沉积：高生长单倍型对应较低的</w:t>
       </w:r>
       <w:r>
         <w:rPr>
           <w:i/>
         </w:rPr>
-        <w:t xml:space="preserve">MC1R</w:t>
-      </w:r>
-      <w:r>
-        <w:t xml:space="preserve">、</w:t>
+        <w:t xml:space="preserve">CCKAR</w:t>
+      </w:r>
+      <w:r>
+        <w:t xml:space="preserve">表达和减弱的饱腹反馈</w:t>
+      </w:r>
+      <w:r>
+        <w:rPr>
+          <w:vertAlign w:val="superscript"/>
+        </w:rPr>
+        <w:t xml:space="preserve">[99]</w:t>
+      </w:r>
+      <w:r>
+        <w:t xml:space="preserve">，</w:t>
       </w:r>
       <w:r>
         <w:rPr>
           <w:i/>
         </w:rPr>
-        <w:t xml:space="preserve">GJA5</w:t>
-      </w:r>
-      <w:r>
-        <w:t xml:space="preserve">）</w:t>
+        <w:t xml:space="preserve">IGF2BP1</w:t>
+      </w:r>
+      <w:r>
+        <w:t xml:space="preserve">上游缺失提高调控活性，并与较大体型相关</w:t>
       </w:r>
       <w:r>
         <w:rPr>
           <w:vertAlign w:val="superscript"/>
         </w:rPr>
-        <w:t xml:space="preserve">[116,117]</w:t>
-      </w:r>
-      <w:r>
-        <w:t xml:space="preserve">，真皮与结缔组织黑色素沉着（</w:t>
+        <w:t xml:space="preserve">[100]</w:t>
+      </w:r>
+      <w:r>
+        <w:t xml:space="preserve">。Connecticut伴性矮小鸡的</w:t>
       </w:r>
       <w:r>
         <w:rPr>
           <w:i/>
         </w:rPr>
-        <w:t xml:space="preserve">EDN3</w:t>
-      </w:r>
-      <w:r>
-        <w:t xml:space="preserve">）</w:t>
+        <w:t xml:space="preserve">GHR</w:t>
+      </w:r>
+      <w:r>
+        <w:t xml:space="preserve">基因3′端1773 bp缺失则与受体缺陷和矮小表型相关</w:t>
       </w:r>
       <w:r>
         <w:rPr>
           <w:vertAlign w:val="superscript"/>
         </w:rPr>
-        <w:t xml:space="preserve">[118]</w:t>
-      </w:r>
-      <w:r>
-        <w:t xml:space="preserve">，羽毛结构（</w:t>
+        <w:t xml:space="preserve">[101]</w:t>
+      </w:r>
+      <w:r>
+        <w:t xml:space="preserve">。在腹脂双向选择鸡系中，13 bp插入缺失位点rs734209466的插入等位型通过转录因子IRF4增强远端</w:t>
       </w:r>
       <w:r>
         <w:rPr>
           <w:i/>
         </w:rPr>
-        <w:t xml:space="preserve">PDSS2</w:t>
-      </w:r>
-      <w:r>
-        <w:t xml:space="preserve">及角蛋白相关基因）</w:t>
+        <w:t xml:space="preserve">IGFBP2</w:t>
+      </w:r>
+      <w:r>
+        <w:t xml:space="preserve">和</w:t>
+      </w:r>
+      <w:r>
+        <w:rPr>
+          <w:i/>
+        </w:rPr>
+        <w:t xml:space="preserve">IGFBP5</w:t>
+      </w:r>
+      <w:r>
+        <w:t xml:space="preserve">的表达，影响前脂肪细胞增殖与分化</w:t>
       </w:r>
       <w:r>
         <w:rPr>
           <w:vertAlign w:val="superscript"/>
         </w:rPr>
-        <w:t xml:space="preserve">[119,120,121]</w:t>
-      </w:r>
-      <w:r>
-        <w:t xml:space="preserve">，局部羽毛分布（</w:t>
-      </w:r>
-      <w:r>
-        <w:rPr>
-          <w:i/>
-        </w:rPr>
-        <w:t xml:space="preserve">HOXC10</w:t>
-      </w:r>
-      <w:r>
-        <w:t xml:space="preserve">、</w:t>
-      </w:r>
-      <w:r>
-        <w:rPr>
-          <w:i/>
-        </w:rPr>
-        <w:t xml:space="preserve">TBX5</w:t>
-      </w:r>
-      <w:r>
-        <w:t xml:space="preserve">、</w:t>
-      </w:r>
-      <w:r>
-        <w:rPr>
-          <w:i/>
-        </w:rPr>
-        <w:t xml:space="preserve">PITX1</w:t>
-      </w:r>
-      <w:r>
-        <w:t xml:space="preserve">）</w:t>
+        <w:t xml:space="preserve">[102]</w:t>
+      </w:r>
+      <w:r>
+        <w:t xml:space="preserve">。弗吉尼亚长期选择系的研究显示，多个原有遗传变异共同贡献了体重选择响应</w:t>
       </w:r>
       <w:r>
         <w:rPr>
           <w:vertAlign w:val="superscript"/>
         </w:rPr>
-        <w:t xml:space="preserve">[122,123]</w:t>
-      </w:r>
-      <w:r>
-        <w:t xml:space="preserve">，以及鸡冠发育（</w:t>
-      </w:r>
-      <w:r>
-        <w:rPr>
-          <w:i/>
-        </w:rPr>
-        <w:t xml:space="preserve">SOX5</w:t>
-      </w:r>
-      <w:r>
-        <w:t xml:space="preserve">、</w:t>
-      </w:r>
-      <w:r>
-        <w:rPr>
-          <w:i/>
-        </w:rPr>
-        <w:t xml:space="preserve">MNR2</w:t>
-      </w:r>
-      <w:r>
-        <w:t xml:space="preserve">）</w:t>
+        <w:t xml:space="preserve">[103]</w:t>
+      </w:r>
+      <w:r>
+        <w:t xml:space="preserve">。该系列的互交研究还识别出Growth9与另外三个基因座组成的互作网络，其他基因座的促生长效应取决于Growth9的基因型</w:t>
       </w:r>
       <w:r>
         <w:rPr>
           <w:vertAlign w:val="superscript"/>
         </w:rPr>
-        <w:t xml:space="preserve">[124,125]</w:t>
-      </w:r>
-      <w:r>
-        <w:t xml:space="preserve">。不同氨基酸替换的组合对</w:t>
-      </w:r>
-      <w:r>
-        <w:rPr>
-          <w:i/>
-        </w:rPr>
-        <w:t xml:space="preserve">MC1R</w:t>
-      </w:r>
-      <w:r>
-        <w:t xml:space="preserve">信号产生增强或抑制作用，</w:t>
-      </w:r>
-      <w:r>
-        <w:rPr>
-          <w:i/>
-        </w:rPr>
-        <w:t xml:space="preserve">PDSS2</w:t>
-      </w:r>
-      <w:r>
-        <w:t xml:space="preserve">调控变异降低其表达，</w:t>
-      </w:r>
-      <w:r>
-        <w:rPr>
-          <w:i/>
-        </w:rPr>
-        <w:t xml:space="preserve">HOXC10</w:t>
-      </w:r>
-      <w:r>
-        <w:t xml:space="preserve">内含子的197 bp重复与头部</w:t>
-      </w:r>
-      <w:r>
-        <w:rPr>
-          <w:i/>
-        </w:rPr>
-        <w:t xml:space="preserve">HOXC</w:t>
-      </w:r>
-      <w:r>
-        <w:t xml:space="preserve">基因簇异位表达及羽冠形成相关</w:t>
+        <w:t xml:space="preserve">[104]</w:t>
+      </w:r>
+      <w:r>
+        <w:t xml:space="preserve">。另在优质鸡系HQLA与惠阳胡须鸡建立的F₁₆高级互交群体中，多组织分析识别了与生长性状相关的组织特异调控关系</w:t>
       </w:r>
       <w:r>
         <w:rPr>
           <w:vertAlign w:val="superscript"/>
         </w:rPr>
-        <w:t xml:space="preserve">[116,119,122]</w:t>
-      </w:r>
-      <w:r>
-        <w:t xml:space="preserve">。卷羽的遗传基础存在品种差异：早期研究鉴定了</w:t>
-      </w:r>
-      <w:r>
-        <w:rPr>
-          <w:i/>
-        </w:rPr>
-        <w:t xml:space="preserve">KRT6A</w:t>
-      </w:r>
-      <w:r>
-        <w:t xml:space="preserve">（原文称</w:t>
-      </w:r>
-      <w:r>
-        <w:rPr>
-          <w:i/>
-        </w:rPr>
-        <w:t xml:space="preserve">KRT75</w:t>
-      </w:r>
-      <w:r>
-        <w:t xml:space="preserve">）变异，麒麟鸡卷羽则与</w:t>
-      </w:r>
-      <w:r>
-        <w:rPr>
-          <w:i/>
-        </w:rPr>
-        <w:t xml:space="preserve">KRT75L4</w:t>
-      </w:r>
-      <w:r>
-        <w:t xml:space="preserve">的15 bp缺失相关</w:t>
+        <w:t xml:space="preserve">[105]</w:t>
+      </w:r>
+      <w:r>
+        <w:t xml:space="preserve">。在斯洛文尼亚Prelux-bro品系34代双向选择中，模型估计高体重系约在6～8代达到总选择响应的一半，低体重系则需20～28代</w:t>
       </w:r>
       <w:r>
         <w:rPr>
           <w:vertAlign w:val="superscript"/>
         </w:rPr>
-        <w:t xml:space="preserve">[120,121]</w:t>
-      </w:r>
-      <w:r>
-        <w:t xml:space="preserve">。44个群体的517只纤维黑色素沉着鸡共享</w:t>
-      </w:r>
-      <w:r>
-        <w:rPr>
-          <w:i/>
-        </w:rPr>
-        <w:t xml:space="preserve">EDN3</w:t>
-      </w:r>
-      <w:r>
-        <w:t xml:space="preserve">区域的复杂重排</w:t>
+        <w:t xml:space="preserve">[106]</w:t>
+      </w:r>
+      <w:r>
+        <w:t xml:space="preserve">；中国肉鸡经13代剩余采食量选择，低剩余采食量系在降低采食量和料重比的同时维持了生长表现</w:t>
       </w:r>
       <w:r>
         <w:rPr>
           <w:vertAlign w:val="superscript"/>
         </w:rPr>
-        <w:t xml:space="preserve">[118,126]</w:t>
-      </w:r>
-      <w:r>
-        <w:t xml:space="preserve">。玫瑰冠R1等位型的结构重排改变鸡冠形态，并与R1纯合雄鸡精子运动能力下降相关</w:t>
-      </w:r>
-      <w:r>
-        <w:rPr>
-          <w:vertAlign w:val="superscript"/>
-        </w:rPr>
-        <w:t xml:space="preserve">[125]</w:t>
+        <w:t xml:space="preserve">[107]</w:t>
       </w:r>
       <w:r>
         <w:t xml:space="preserve">。</w:t>
@@ -5480,6 +5117,385 @@
         <w:rPr>
           <w:b/>
         </w:rPr>
+        <w:t xml:space="preserve">繁殖。</w:t>
+      </w:r>
+      <w:r>
+        <w:t xml:space="preserve">繁殖改良涉及性成熟、产蛋持续性、孵抱行为和受精能力。相关遗传差异包括光周期反应（</w:t>
+      </w:r>
+      <w:r>
+        <w:rPr>
+          <w:i/>
+        </w:rPr>
+        <w:t xml:space="preserve">TSHR</w:t>
+      </w:r>
+      <w:r>
+        <w:t xml:space="preserve">）</w:t>
+      </w:r>
+      <w:r>
+        <w:rPr>
+          <w:vertAlign w:val="superscript"/>
+        </w:rPr>
+        <w:t xml:space="preserve">[108]</w:t>
+      </w:r>
+      <w:r>
+        <w:t xml:space="preserve">、孵抱行为相关基因座</w:t>
+      </w:r>
+      <w:r>
+        <w:rPr>
+          <w:vertAlign w:val="superscript"/>
+        </w:rPr>
+        <w:t xml:space="preserve">[109]</w:t>
+      </w:r>
+      <w:r>
+        <w:t xml:space="preserve">，以及骨代谢与繁殖性状共享的遗传区域（</w:t>
+      </w:r>
+      <w:r>
+        <w:rPr>
+          <w:i/>
+        </w:rPr>
+        <w:t xml:space="preserve">HAO1</w:t>
+      </w:r>
+      <w:r>
+        <w:t xml:space="preserve">、</w:t>
+      </w:r>
+      <w:r>
+        <w:rPr>
+          <w:i/>
+        </w:rPr>
+        <w:t xml:space="preserve">BMP2</w:t>
+      </w:r>
+      <w:r>
+        <w:t xml:space="preserve">附近）</w:t>
+      </w:r>
+      <w:r>
+        <w:rPr>
+          <w:vertAlign w:val="superscript"/>
+        </w:rPr>
+        <w:t xml:space="preserve">[110]</w:t>
+      </w:r>
+      <w:r>
+        <w:t xml:space="preserve">。在红原鸡与白来航互交群体中，携带</w:t>
+      </w:r>
+      <w:r>
+        <w:rPr>
+          <w:i/>
+        </w:rPr>
+        <w:t xml:space="preserve">TSHR</w:t>
+      </w:r>
+      <w:r>
+        <w:t xml:space="preserve"> 558Arg等位基因的纯合雄鸡对日长缩短的睾丸反应较弱；在白来航与丝羽鸡互交群体中，不孵抱亲本来源的等位基因在不同基因座分别促进或抑制孵抱</w:t>
+      </w:r>
+      <w:r>
+        <w:rPr>
+          <w:vertAlign w:val="superscript"/>
+        </w:rPr>
+        <w:t xml:space="preserve">[108,109]</w:t>
+      </w:r>
+      <w:r>
+        <w:t xml:space="preserve">。产蛋调控随阶段变化：对1004只鸡全基因组及至700日龄产蛋记录的联合分析，检出了分期产蛋的加性和显性效应</w:t>
+      </w:r>
+      <w:r>
+        <w:rPr>
+          <w:vertAlign w:val="superscript"/>
+        </w:rPr>
+        <w:t xml:space="preserve">[111]</w:t>
+      </w:r>
+      <w:r>
+        <w:t xml:space="preserve">。另一项研究对商业白洛克母鸡在20、30和58周龄采集的下丘脑、垂体、卵巢及肝脏样本进行分析，显示调控效应具有组织和阶段特异性</w:t>
+      </w:r>
+      <w:r>
+        <w:rPr>
+          <w:vertAlign w:val="superscript"/>
+        </w:rPr>
+        <w:t xml:space="preserve">[112]</w:t>
+      </w:r>
+      <w:r>
+        <w:t xml:space="preserve">。地方鸡长期选择资料中，开产日龄与产蛋量的遗传相关因品系和代次而异</w:t>
+      </w:r>
+      <w:r>
+        <w:rPr>
+          <w:vertAlign w:val="superscript"/>
+        </w:rPr>
+        <w:t xml:space="preserve">[113]</w:t>
+      </w:r>
+      <w:r>
+        <w:t xml:space="preserve">；弗吉尼亚鸡54代8周龄体重双向选择中，低体重选择系的性成熟延迟更明显</w:t>
+      </w:r>
+      <w:r>
+        <w:rPr>
+          <w:vertAlign w:val="superscript"/>
+        </w:rPr>
+        <w:t xml:space="preserve">[114]</w:t>
+      </w:r>
+      <w:r>
+        <w:t xml:space="preserve">。雄鸡的精子运动能力具有遗传基础，并影响雌体储精后的受精效率</w:t>
+      </w:r>
+      <w:r>
+        <w:rPr>
+          <w:vertAlign w:val="superscript"/>
+        </w:rPr>
+        <w:t xml:space="preserve">[115]</w:t>
+      </w:r>
+      <w:r>
+        <w:t xml:space="preserve">。</w:t>
+      </w:r>
+    </w:p>
+    <w:p>
+      <w:pPr>
+        <w:jc w:val="both"/>
+      </w:pPr>
+      <w:r>
+        <w:rPr>
+          <w:b/>
+        </w:rPr>
+        <w:t xml:space="preserve">外形与观赏性状。</w:t>
+      </w:r>
+      <w:r>
+        <w:t xml:space="preserve">家鸡在羽色、羽型、皮肤色素及头部和四肢外形上形成了丰富的品种差异。这些性状涉及羽色和羽内图案（</w:t>
+      </w:r>
+      <w:r>
+        <w:rPr>
+          <w:i/>
+        </w:rPr>
+        <w:t xml:space="preserve">MC1R</w:t>
+      </w:r>
+      <w:r>
+        <w:t xml:space="preserve">、</w:t>
+      </w:r>
+      <w:r>
+        <w:rPr>
+          <w:i/>
+        </w:rPr>
+        <w:t xml:space="preserve">GJA5</w:t>
+      </w:r>
+      <w:r>
+        <w:t xml:space="preserve">）</w:t>
+      </w:r>
+      <w:r>
+        <w:rPr>
+          <w:vertAlign w:val="superscript"/>
+        </w:rPr>
+        <w:t xml:space="preserve">[116,117]</w:t>
+      </w:r>
+      <w:r>
+        <w:t xml:space="preserve">，真皮与结缔组织黑色素沉着（</w:t>
+      </w:r>
+      <w:r>
+        <w:rPr>
+          <w:i/>
+        </w:rPr>
+        <w:t xml:space="preserve">EDN3</w:t>
+      </w:r>
+      <w:r>
+        <w:t xml:space="preserve">）</w:t>
+      </w:r>
+      <w:r>
+        <w:rPr>
+          <w:vertAlign w:val="superscript"/>
+        </w:rPr>
+        <w:t xml:space="preserve">[118]</w:t>
+      </w:r>
+      <w:r>
+        <w:t xml:space="preserve">，羽毛结构（</w:t>
+      </w:r>
+      <w:r>
+        <w:rPr>
+          <w:i/>
+        </w:rPr>
+        <w:t xml:space="preserve">PDSS2</w:t>
+      </w:r>
+      <w:r>
+        <w:t xml:space="preserve">及角蛋白相关基因）</w:t>
+      </w:r>
+      <w:r>
+        <w:rPr>
+          <w:vertAlign w:val="superscript"/>
+        </w:rPr>
+        <w:t xml:space="preserve">[119,120,121]</w:t>
+      </w:r>
+      <w:r>
+        <w:t xml:space="preserve">，局部羽毛分布（</w:t>
+      </w:r>
+      <w:r>
+        <w:rPr>
+          <w:i/>
+        </w:rPr>
+        <w:t xml:space="preserve">HOXC10</w:t>
+      </w:r>
+      <w:r>
+        <w:t xml:space="preserve">、</w:t>
+      </w:r>
+      <w:r>
+        <w:rPr>
+          <w:i/>
+        </w:rPr>
+        <w:t xml:space="preserve">TBX5</w:t>
+      </w:r>
+      <w:r>
+        <w:t xml:space="preserve">、</w:t>
+      </w:r>
+      <w:r>
+        <w:rPr>
+          <w:i/>
+        </w:rPr>
+        <w:t xml:space="preserve">PITX1</w:t>
+      </w:r>
+      <w:r>
+        <w:t xml:space="preserve">）</w:t>
+      </w:r>
+      <w:r>
+        <w:rPr>
+          <w:vertAlign w:val="superscript"/>
+        </w:rPr>
+        <w:t xml:space="preserve">[122,123]</w:t>
+      </w:r>
+      <w:r>
+        <w:t xml:space="preserve">，以及鸡冠发育（</w:t>
+      </w:r>
+      <w:r>
+        <w:rPr>
+          <w:i/>
+        </w:rPr>
+        <w:t xml:space="preserve">SOX5</w:t>
+      </w:r>
+      <w:r>
+        <w:t xml:space="preserve">、</w:t>
+      </w:r>
+      <w:r>
+        <w:rPr>
+          <w:i/>
+        </w:rPr>
+        <w:t xml:space="preserve">MNR2</w:t>
+      </w:r>
+      <w:r>
+        <w:t xml:space="preserve">）</w:t>
+      </w:r>
+      <w:r>
+        <w:rPr>
+          <w:vertAlign w:val="superscript"/>
+        </w:rPr>
+        <w:t xml:space="preserve">[124,125]</w:t>
+      </w:r>
+      <w:r>
+        <w:t xml:space="preserve">。不同氨基酸替换的组合对</w:t>
+      </w:r>
+      <w:r>
+        <w:rPr>
+          <w:i/>
+        </w:rPr>
+        <w:t xml:space="preserve">MC1R</w:t>
+      </w:r>
+      <w:r>
+        <w:t xml:space="preserve">信号产生增强或抑制作用，</w:t>
+      </w:r>
+      <w:r>
+        <w:rPr>
+          <w:i/>
+        </w:rPr>
+        <w:t xml:space="preserve">PDSS2</w:t>
+      </w:r>
+      <w:r>
+        <w:t xml:space="preserve">调控变异降低其表达，</w:t>
+      </w:r>
+      <w:r>
+        <w:rPr>
+          <w:i/>
+        </w:rPr>
+        <w:t xml:space="preserve">HOXC10</w:t>
+      </w:r>
+      <w:r>
+        <w:t xml:space="preserve">内含子的197 bp重复与头部</w:t>
+      </w:r>
+      <w:r>
+        <w:rPr>
+          <w:i/>
+        </w:rPr>
+        <w:t xml:space="preserve">HOXC</w:t>
+      </w:r>
+      <w:r>
+        <w:t xml:space="preserve">基因簇异位表达及羽冠形成相关</w:t>
+      </w:r>
+      <w:r>
+        <w:rPr>
+          <w:vertAlign w:val="superscript"/>
+        </w:rPr>
+        <w:t xml:space="preserve">[116,119,122]</w:t>
+      </w:r>
+      <w:r>
+        <w:t xml:space="preserve">。卷羽的遗传基础存在品种差异：早期研究鉴定了</w:t>
+      </w:r>
+      <w:r>
+        <w:rPr>
+          <w:i/>
+        </w:rPr>
+        <w:t xml:space="preserve">KRT6A</w:t>
+      </w:r>
+      <w:r>
+        <w:t xml:space="preserve">（原文称</w:t>
+      </w:r>
+      <w:r>
+        <w:rPr>
+          <w:i/>
+        </w:rPr>
+        <w:t xml:space="preserve">KRT75</w:t>
+      </w:r>
+      <w:r>
+        <w:t xml:space="preserve">）变异，麒麟鸡卷羽则与</w:t>
+      </w:r>
+      <w:r>
+        <w:rPr>
+          <w:i/>
+        </w:rPr>
+        <w:t xml:space="preserve">KRT75L4</w:t>
+      </w:r>
+      <w:r>
+        <w:t xml:space="preserve">的15 bp缺失相关</w:t>
+      </w:r>
+      <w:r>
+        <w:rPr>
+          <w:vertAlign w:val="superscript"/>
+        </w:rPr>
+        <w:t xml:space="preserve">[120,121]</w:t>
+      </w:r>
+      <w:r>
+        <w:t xml:space="preserve">。44个群体的517只纤维黑色素沉着鸡共享</w:t>
+      </w:r>
+      <w:r>
+        <w:rPr>
+          <w:i/>
+        </w:rPr>
+        <w:t xml:space="preserve">EDN3</w:t>
+      </w:r>
+      <w:r>
+        <w:t xml:space="preserve">区域的复杂重排</w:t>
+      </w:r>
+      <w:r>
+        <w:rPr>
+          <w:vertAlign w:val="superscript"/>
+        </w:rPr>
+        <w:t xml:space="preserve">[118,126]</w:t>
+      </w:r>
+      <w:r>
+        <w:t xml:space="preserve">。玫瑰冠R1等位型的结构重排改变鸡冠形态，并与R1纯合雄鸡精子运动能力下降相关</w:t>
+      </w:r>
+      <w:r>
+        <w:rPr>
+          <w:vertAlign w:val="superscript"/>
+        </w:rPr>
+        <w:t xml:space="preserve">[125]</w:t>
+      </w:r>
+      <w:r>
+        <w:t xml:space="preserve">。</w:t>
+      </w:r>
+    </w:p>
+    <w:p>
+      <w:pPr>
+        <w:jc w:val="both"/>
+      </w:pPr>
+      <w:r>
+        <w:rPr>
+          <w:b/>
+        </w:rPr>
         <w:t xml:space="preserve">斗鸡。</w:t>
       </w:r>
       <w:r>
@@ -5553,6 +5569,32 @@
           <w:vertAlign w:val="superscript"/>
         </w:rPr>
         <w:t xml:space="preserve">[25]</w:t>
+      </w:r>
+      <w:r>
+        <w:t xml:space="preserve">。</w:t>
+      </w:r>
+    </w:p>
+    <w:p>
+      <w:pPr>
+        <w:jc w:val="both"/>
+      </w:pPr>
+      <w:r>
+        <w:t xml:space="preserve">总之，近代定向选择显著改变了生长和繁殖性状；选择响应既来自多个原有遗传变异的共同作用，也涉及调控变异和结构变异，如</w:t>
+      </w:r>
+      <w:r>
+        <w:rPr>
+          <w:i/>
+        </w:rPr>
+        <w:t xml:space="preserve">IGF2BP1</w:t>
+      </w:r>
+      <w:r>
+        <w:t xml:space="preserve">上游缺失、rs734209466和玫瑰冠R1重排</w:t>
+      </w:r>
+      <w:r>
+        <w:rPr>
+          <w:vertAlign w:val="superscript"/>
+        </w:rPr>
+        <w:t xml:space="preserve">[100,102,103,125]</w:t>
       </w:r>
       <w:r>
         <w:t xml:space="preserve">。</w:t>

</xml_diff>

<commit_message>
Section 7 review edits: title, intro, conclusion, interference paragraph, [137] and [150] wording
</commit_message>
<xml_diff>
--- a/3-7_v12_clean.docx
+++ b/3-7_v12_clean.docx
@@ -5605,35 +5605,23 @@
         <w:pStyle w:val="Heading1"/>
       </w:pPr>
       <w:r>
-        <w:t xml:space="preserve">7 基因交流</w:t>
+        <w:t xml:space="preserve">7 驯化后的基因交流</w:t>
       </w:r>
     </w:p>
     <w:p>
       <w:pPr>
-        <w:pStyle w:val="Heading2"/>
-      </w:pPr>
-      <w:r>
-        <w:t xml:space="preserve">7.1 家鸡与原鸡的基因交流</w:t>
+        <w:jc w:val="both"/>
+      </w:pPr>
+      <w:r>
+        <w:t xml:space="preserve">驯化以后，家鸡、原鸡和商业种源之间的基因交流仍在持续。本节依次讨论家鸡与原鸡（7.1）、商业种源与地方群体（7.2），以及逸生群体（7.3）之间的交流。</w:t>
       </w:r>
     </w:p>
     <w:p>
       <w:pPr>
-        <w:jc w:val="both"/>
-      </w:pPr>
-      <w:r>
-        <w:t xml:space="preserve">其他原鸡物种对家鸡的局部遗传贡献及相关功能证据已在第3.3节讨论。家鸡传播到不同地区后，还与当地红原鸡发生了基因交流。越南地方鸡的微卫星研究和涵盖863个基因组的跨地区分析，均支持当地红原鸡在驯化后向家鸡输入遗传成分</w:t>
-      </w:r>
-      <w:r>
-        <w:rPr>
-          <w:vertAlign w:val="superscript"/>
-        </w:rPr>
-        <w:t xml:space="preserve">[18,131]</w:t>
-      </w:r>
-      <w:r>
-        <w:t xml:space="preserve">。</w:t>
-      </w:r>
-      <w:r>
-        <w:t>红原鸡、地方与传统家鸡及商业鸡之间的主要遗传联系见图3。</w:t>
+        <w:pStyle w:val="Heading2"/>
+      </w:pPr>
+      <w:r>
+        <w:t xml:space="preserve">7.1 家鸡与原鸡的基因交流</w:t>
       </w:r>
     </w:p>
     <w:p>
@@ -5641,34 +5629,19 @@
         <w:jc w:val="both"/>
       </w:pPr>
       <w:r>
-        <w:t xml:space="preserve">家鸡向原鸡的反向输入也改变了野生群体的遗传组成。印度的核标记研究和新加坡的基因组分析均检出家鸡向红原鸡的渗入，个体间的渗入程度不同</w:t>
+        <w:t xml:space="preserve">其他原鸡物种对家鸡的局部遗传贡献及相关功能证据已在第3.3节讨论。家鸡传播到不同地区后，还与当地红原鸡发生了基因交流。越南地方鸡的微卫星研究和涵盖863个基因组的跨地区分析，均支持当地红原鸡在驯化后向家鸡输入遗传成分</w:t>
       </w:r>
       <w:r>
         <w:rPr>
           <w:vertAlign w:val="superscript"/>
         </w:rPr>
-        <w:t xml:space="preserve">[20,132]</w:t>
-      </w:r>
-      <w:r>
-        <w:t xml:space="preserve">。以历史标本为参照，51只家鸡与63只原鸡的基因组比较显示，近百年来家鸡输入增加；其中部分现代红原鸡的全局家鸡祖源估计约占20%～50%</w:t>
-      </w:r>
-      <w:r>
-        <w:rPr>
-          <w:vertAlign w:val="superscript"/>
-        </w:rPr>
-        <w:t xml:space="preserve">[19]</w:t>
-      </w:r>
-      <w:r>
-        <w:t xml:space="preserve">。30个核内含子的分析还支持家鸡向绿原鸡的输入</w:t>
-      </w:r>
-      <w:r>
-        <w:rPr>
-          <w:vertAlign w:val="superscript"/>
-        </w:rPr>
-        <w:t xml:space="preserve">[15]</w:t>
+        <w:t xml:space="preserve">[18,131]</w:t>
       </w:r>
       <w:r>
         <w:t xml:space="preserve">。</w:t>
+      </w:r>
+      <w:r>
+        <w:t>红原鸡、地方与传统家鸡及商业鸡之间的主要遗传联系见图3。</w:t>
       </w:r>
     </w:p>
     <w:p>
@@ -5676,40 +5649,31 @@
         <w:jc w:val="both"/>
       </w:pPr>
       <w:r>
-        <w:t xml:space="preserve">原鸡属的系统基因组研究提示，一些种间交流早于家鸡驯化</w:t>
+        <w:t xml:space="preserve">家鸡向原鸡的反向输入也改变了野生群体的遗传组成。印度的核标记研究和新加坡的基因组分析均检出家鸡向红原鸡的渗入，个体间的渗入程度不同</w:t>
       </w:r>
       <w:r>
         <w:rPr>
           <w:vertAlign w:val="superscript"/>
         </w:rPr>
-        <w:t xml:space="preserve">[133]</w:t>
-      </w:r>
-      <w:r>
-        <w:t xml:space="preserve">。圈养与野外样本也存在差别：所研究的圈养灰原鸡常染色体基因组中约10%的成分来自</w:t>
-      </w:r>
-      <w:r>
-        <w:rPr>
-          <w:i/>
-        </w:rPr>
-        <w:t xml:space="preserve">G. gallus</w:t>
-      </w:r>
-      <w:r>
-        <w:t xml:space="preserve">，同一研究的两只野生灰原鸡未检出相应信号</w:t>
+        <w:t xml:space="preserve">[20,132]</w:t>
+      </w:r>
+      <w:r>
+        <w:t xml:space="preserve">。以历史标本为参照，51只家鸡与63只原鸡的基因组比较显示，近百年来家鸡输入增加；其中部分现代红原鸡的全局家鸡祖源估计约占20%～50%</w:t>
       </w:r>
       <w:r>
         <w:rPr>
           <w:vertAlign w:val="superscript"/>
         </w:rPr>
-        <w:t xml:space="preserve">[134]</w:t>
-      </w:r>
-      <w:r>
-        <w:t xml:space="preserve">。杂交回交实验还发现，保留家鸡来源的遗传成分的后代仍可呈现典型原鸡外观</w:t>
+        <w:t xml:space="preserve">[19]</w:t>
+      </w:r>
+      <w:r>
+        <w:t xml:space="preserve">。30个核内含子的分析还支持家鸡向绿原鸡的输入</w:t>
       </w:r>
       <w:r>
         <w:rPr>
           <w:vertAlign w:val="superscript"/>
         </w:rPr>
-        <w:t xml:space="preserve">[135]</w:t>
+        <w:t xml:space="preserve">[15]</w:t>
       </w:r>
       <w:r>
         <w:t xml:space="preserve">。</w:t>
@@ -5720,95 +5684,86 @@
         <w:jc w:val="both"/>
       </w:pPr>
       <w:r>
-        <w:t xml:space="preserve">现代原鸡研究中的家鸡参照已包括具体商业品系。新加坡研究采用了Bovan褐壳和白壳蛋鸡，历史标本研究仅使用商业鸡作为家鸡参照时，仍检出家鸡输入趋势</w:t>
+        <w:t xml:space="preserve">识别原鸡中的家鸡成分，还受到三方面因素干扰。原鸡属系统基因组研究检出部分谱系之间较古老的种间渗入</w:t>
       </w:r>
       <w:r>
         <w:rPr>
           <w:vertAlign w:val="superscript"/>
         </w:rPr>
-        <w:t xml:space="preserve">[19,132]</w:t>
-      </w:r>
-      <w:r>
-        <w:t xml:space="preserve">。菲律宾原鸡与商业鸡共享线粒体单倍型，显示了两者的母系联系</w:t>
+        <w:t xml:space="preserve">[133]</w:t>
+      </w:r>
+      <w:r>
+        <w:t xml:space="preserve">；所研究的圈养灰原鸡常染色体基因组中约10%来自</w:t>
+      </w:r>
+      <w:r>
+        <w:rPr>
+          <w:i/>
+        </w:rPr>
+        <w:t xml:space="preserve">G. gallus</w:t>
+      </w:r>
+      <w:r>
+        <w:t xml:space="preserve">，而同一研究中的两只野生灰原鸡未检出相应信号</w:t>
       </w:r>
       <w:r>
         <w:rPr>
           <w:vertAlign w:val="superscript"/>
         </w:rPr>
-        <w:t xml:space="preserve">[136]</w:t>
-      </w:r>
-      <w:r>
-        <w:t xml:space="preserve">。迁移模型还检出上海新杨蛋鸡指向红原鸡参照群体，以及日本圈养红原鸡指向白来航的迁移边</w:t>
+        <w:t xml:space="preserve">[134]</w:t>
+      </w:r>
+      <w:r>
+        <w:t xml:space="preserve">；杂交回交实验还发现，保留家鸡来源遗传成分的后代仍可呈现典型的原鸡外观</w:t>
       </w:r>
       <w:r>
         <w:rPr>
           <w:vertAlign w:val="superscript"/>
         </w:rPr>
-        <w:t xml:space="preserve">[137,138]</w:t>
-      </w:r>
-      <w:r>
-        <w:t xml:space="preserve">。这些研究尚未确定输入原生野生原鸡的具体商业供体与传播路径。</w:t>
+        <w:t xml:space="preserve">[135]</w:t>
+      </w:r>
+      <w:r>
+        <w:t xml:space="preserve">。</w:t>
       </w:r>
     </w:p>
     <w:p>
       <w:pPr>
-        <w:pStyle w:val="Heading2"/>
-      </w:pPr>
-      <w:r>
-        <w:t xml:space="preserve">7.2 商业种源与地方群体的交流</w:t>
+        <w:jc w:val="both"/>
+      </w:pPr>
+      <w:r>
+        <w:t xml:space="preserve">现代原鸡研究中的家鸡参照已包括具体商业品系。新加坡研究采用了Bovan褐壳和白壳蛋鸡，历史标本研究仅使用商业鸡作为家鸡参照时，仍检出家鸡输入趋势</w:t>
+      </w:r>
+      <w:r>
+        <w:rPr>
+          <w:vertAlign w:val="superscript"/>
+        </w:rPr>
+        <w:t xml:space="preserve">[19,132]</w:t>
+      </w:r>
+      <w:r>
+        <w:t xml:space="preserve">。菲律宾原鸡与商业鸡共享线粒体单倍型，显示了两者的母系联系</w:t>
+      </w:r>
+      <w:r>
+        <w:rPr>
+          <w:vertAlign w:val="superscript"/>
+        </w:rPr>
+        <w:t xml:space="preserve">[136]</w:t>
+      </w:r>
+      <w:r>
+        <w:t xml:space="preserve">。贵州鸡群的迁移模型检出由其他鸡群指向红原鸡参照群体的迁移边，日本圈养红原鸡的分析则检出由圈养红原鸡指向白来航的迁移边</w:t>
+      </w:r>
+      <w:r>
+        <w:rPr>
+          <w:vertAlign w:val="superscript"/>
+        </w:rPr>
+        <w:t xml:space="preserve">[137,138]</w:t>
+      </w:r>
+      <w:r>
+        <w:t xml:space="preserve">。这些研究尚未确定输入原生野生原鸡的具体商业供体与传播路径。</w:t>
       </w:r>
     </w:p>
     <w:p>
       <w:pPr>
-        <w:jc w:val="both"/>
-      </w:pPr>
-      <w:r>
-        <w:t xml:space="preserve">地方和传统品种参与了商业鸡的育成，商业种源又向地方群体输入遗传成分。线粒体研究显示，东亚鸡曾多次参与荷兰传统品种及西方商业鸡的母系构成；涵盖636个基因组、43个群体的分析进一步表明，亚洲重型品种是现代肉鸡的重要祖源</w:t>
-      </w:r>
-      <w:r>
-        <w:rPr>
-          <w:vertAlign w:val="superscript"/>
-        </w:rPr>
-        <w:t xml:space="preserve">[139,140]</w:t>
-      </w:r>
-      <w:r>
-        <w:t xml:space="preserve">。迁移模型支持中国斗鸡向商业洛岛红鸡、沙栏鸡向商业麻黄鸡，以及商业小白鸡向阳山鸡和惠阳胡须鸡的基因交流</w:t>
-      </w:r>
-      <w:r>
-        <w:rPr>
-          <w:vertAlign w:val="superscript"/>
-        </w:rPr>
-        <w:t xml:space="preserve">[141,142]</w:t>
-      </w:r>
-      <w:r>
-        <w:t xml:space="preserve">。华南的微卫星研究较早检出了商业鸡与地方鸡的混合信号</w:t>
-      </w:r>
-      <w:r>
-        <w:rPr>
-          <w:vertAlign w:val="superscript"/>
-        </w:rPr>
-        <w:t xml:space="preserve">[143]</w:t>
-      </w:r>
-      <w:r>
-        <w:t xml:space="preserve">。随后，针对1187只鸡的基因组芯片分析以白洛克肉鸡为参照，在8个中国地方品种中识别出商业相关的候选渗入区段</w:t>
-      </w:r>
-      <w:r>
-        <w:rPr>
-          <w:vertAlign w:val="superscript"/>
-        </w:rPr>
-        <w:t xml:space="preserve">[21]</w:t>
-      </w:r>
-      <w:r>
-        <w:t xml:space="preserve">。商业成分的输入也见于其他地方群体：部分藏鸡带有白来航相关成分，贵州部分地方品种显示上海新杨蛋鸡相关输入，江西部分品种则检出欧洲商业鸡的混合信号</w:t>
-      </w:r>
-      <w:r>
-        <w:rPr>
-          <w:vertAlign w:val="superscript"/>
-        </w:rPr>
-        <w:t xml:space="preserve">[137,144,145]</w:t>
-      </w:r>
-      <w:r>
-        <w:t xml:space="preserve">。</w:t>
+        <w:pStyle w:val="Heading2"/>
+      </w:pPr>
+      <w:r>
+        <w:t xml:space="preserve">7.2 商业种源与地方群体的交流</w:t>
       </w:r>
     </w:p>
     <w:p>
@@ -5816,6 +5771,59 @@
         <w:jc w:val="both"/>
       </w:pPr>
       <w:r>
+        <w:t xml:space="preserve">地方和传统品种参与了商业鸡的育成，商业种源又向地方群体输入遗传成分。线粒体研究显示，东亚鸡曾多次参与荷兰传统品种及西方商业鸡的母系构成；涵盖636个基因组、43个群体的分析进一步表明，亚洲重型品种是现代肉鸡的重要祖源</w:t>
+      </w:r>
+      <w:r>
+        <w:rPr>
+          <w:vertAlign w:val="superscript"/>
+        </w:rPr>
+        <w:t xml:space="preserve">[139,140]</w:t>
+      </w:r>
+      <w:r>
+        <w:t xml:space="preserve">。迁移模型支持中国斗鸡向商业洛岛红鸡、沙栏鸡向商业麻黄鸡，以及商业小白鸡向阳山鸡和惠阳胡须鸡的基因交流</w:t>
+      </w:r>
+      <w:r>
+        <w:rPr>
+          <w:vertAlign w:val="superscript"/>
+        </w:rPr>
+        <w:t xml:space="preserve">[141,142]</w:t>
+      </w:r>
+      <w:r>
+        <w:t xml:space="preserve">。华南的微卫星研究较早检出了商业鸡与地方鸡的混合信号</w:t>
+      </w:r>
+      <w:r>
+        <w:rPr>
+          <w:vertAlign w:val="superscript"/>
+        </w:rPr>
+        <w:t xml:space="preserve">[143]</w:t>
+      </w:r>
+      <w:r>
+        <w:t xml:space="preserve">。随后，针对1187只鸡的基因组芯片分析以白洛克肉鸡为参照，在8个中国地方品种中识别出商业相关的候选渗入区段</w:t>
+      </w:r>
+      <w:r>
+        <w:rPr>
+          <w:vertAlign w:val="superscript"/>
+        </w:rPr>
+        <w:t xml:space="preserve">[21]</w:t>
+      </w:r>
+      <w:r>
+        <w:t xml:space="preserve">。商业成分的输入也见于其他地方群体：部分藏鸡带有白来航相关成分，贵州部分地方品种显示上海新杨蛋鸡相关输入，江西部分品种则检出欧洲商业鸡的混合信号</w:t>
+      </w:r>
+      <w:r>
+        <w:rPr>
+          <w:vertAlign w:val="superscript"/>
+        </w:rPr>
+        <w:t xml:space="preserve">[137,144,145]</w:t>
+      </w:r>
+      <w:r>
+        <w:t xml:space="preserve">。</w:t>
+      </w:r>
+    </w:p>
+    <w:p>
+      <w:pPr>
+        <w:jc w:val="both"/>
+      </w:pPr>
+      <w:r>
         <w:t xml:space="preserve">商业输入还表现出区段和地域差异。白羽文昌鸡的局部单倍型和结构变异支持白羽蛋鸡成分的输入，拜城油鸡也检出白来航相关候选渗入区段</w:t>
       </w:r>
       <w:r>
@@ -5834,7 +5842,7 @@
         <w:t xml:space="preserve">[148,149]</w:t>
       </w:r>
       <w:r>
-        <w:t xml:space="preserve">。东非657只村落鸡中，仅少数个体具有较高的商业簇归属，商业输入不足以解释该区域主要的遗传结构</w:t>
+        <w:t xml:space="preserve">。东非657只村落鸡中，仅10只对商业鸡簇的归属系数高于0.2，商业输入不足以解释该区域主要的遗传结构</w:t>
       </w:r>
       <w:r>
         <w:rPr>
@@ -5992,6 +6000,32 @@
       </w:r>
       <w:r>
         <w:t xml:space="preserve">。</w:t>
+      </w:r>
+    </w:p>
+    <w:p>
+      <w:pPr>
+        <w:jc w:val="both"/>
+      </w:pPr>
+      <w:r>
+        <w:t xml:space="preserve">这些交流带来两方面影响。其一，现代红原鸡已不宜直接作为野生参照：以历史标本为参照检出的部分驯化候选基因，在多数现代红原鸡中已带有家鸡来源的拷贝，若改用现代个体作参照，这些基因将无法被检出</w:t>
+      </w:r>
+      <w:r>
+        <w:rPr>
+          <w:vertAlign w:val="superscript"/>
+        </w:rPr>
+        <w:t xml:space="preserve">[19]</w:t>
+      </w:r>
+      <w:r>
+        <w:t xml:space="preserve">。其二，商业渗入改变了地方鸡的遗传组成，并可能干扰适应信号的识别</w:t>
+      </w:r>
+      <w:r>
+        <w:rPr>
+          <w:vertAlign w:val="superscript"/>
+        </w:rPr>
+        <w:t xml:space="preserve">[21,153]</w:t>
+      </w:r>
+      <w:r>
+        <w:t xml:space="preserve">。因此，利用红原鸡和地方鸡研究驯化与适应时，需要先评估近期混合。</w:t>
       </w:r>
     </w:p>
     <w:p>

</xml_diff>

<commit_message>
Verify [51] and [143]; correct Tell el-Maskhuta entry in Table 1; refine [143] sentence
</commit_message>
<xml_diff>
--- a/3-7_v12_clean.docx
+++ b/3-7_v12_clean.docx
@@ -3202,12 +3202,10 @@
             <w:r>
               <w:rPr>
                 <w:rFonts w:ascii="Times New Roman" w:hAnsi="Times New Roman" w:eastAsia="宋体"/>
-                <w:b w:val="0"/>
-                <w:i w:val="0"/>
                 <w:color w:val="000000"/>
                 <w:sz w:val="19"/>
               </w:rPr>
-              <w:t>Buto：相关层位跨赛特至罗马时期；Tell el-Maskhuta：约公元前320～200年组合</w:t>
+              <w:t xml:space="preserve">Buto：相关层位跨赛特至罗马时期；Tell el-Maskhuta：8件鸡骨中3件可定年，分属希腊化时期、公元前3～2世纪和罗马时期</w:t>
             </w:r>
           </w:p>
         </w:tc>
@@ -3232,12 +3230,10 @@
             <w:r>
               <w:rPr>
                 <w:rFonts w:ascii="Times New Roman" w:hAnsi="Times New Roman" w:eastAsia="宋体"/>
-                <w:b w:val="0"/>
-                <w:i w:val="0"/>
                 <w:color w:val="000000"/>
                 <w:sz w:val="19"/>
               </w:rPr>
-              <w:t>两地鸡骨提供下埃及存在记录；Buto只能定位较宽时期，Tell el-Maskhuta所列组合属于希腊化背景。</w:t>
+              <w:t xml:space="preserve">两地鸡骨提供下埃及存在记录；Buto只能定位较宽时期。Tell el-Maskhuta鸡骨很少，原研究认为当地波斯至罗马时期几乎不养鸡。</w:t>
             </w:r>
           </w:p>
         </w:tc>
@@ -5789,7 +5785,7 @@
         <w:t xml:space="preserve">[141,142]</w:t>
       </w:r>
       <w:r>
-        <w:t xml:space="preserve">。华南的微卫星研究较早检出了商业鸡与地方鸡的混合信号</w:t>
+        <w:t xml:space="preserve">。华南12个地方品种、587只鸡的微卫星分析较早检出了商业鸡向地方鸡的潜在渗入</w:t>
       </w:r>
       <w:r>
         <w:rPr>

</xml_diff>